<commit_message>
Bổ sung gợi ý nhan đề và mở rộng bộ đo tìm kiếm
</commit_message>
<xml_diff>
--- a/ho-so-nop-bai/bao-cao/Bao-cao-tieu-luan-LAMS.docx
+++ b/ho-so-nop-bai/bao-cao/Bao-cao-tieu-luan-LAMS.docx
@@ -169,7 +169,7 @@
         <w:t>Nhóm:</w:t>
       </w:r>
       <w:r>
-        <w:t xml:space="preserve"> hai thành viên. Tên, mã sinh viên, lớp, giảng viên và học kỳ cần điền theo hồ sơ học phần đã được xác nhận. Bản này phản ánh mã nguồn trên nhánh </w:t>
+        <w:t xml:space="preserve"> hai thành viên. Tên, mã sinh viên, lớp, giảng viên và học kỳ cần điền theo hồ sơ học phần đã được xác nhận. Bản này mô tả mã nguồn trên nhánh </w:t>
       </w:r>
       <w:r>
         <w:rPr>
@@ -179,16 +179,6 @@
         <w:t>Tuan/core-platform</w:t>
       </w:r>
       <w:r>
-        <w:t xml:space="preserve"> đến commit </w:t>
-      </w:r>
-      <w:r>
-        <w:rPr>
-          <w:rFonts w:ascii="Consolas" w:hAnsi="Consolas"/>
-          <w:sz w:val="20"/>
-        </w:rPr>
-        <w:t>52606cc</w:t>
-      </w:r>
-      <w:r>
         <w:t xml:space="preserve"> ngày 28/10/2026; đây là bản làm việc của PR #31, chưa phải kết quả nghiệm thu trên </w:t>
       </w:r>
       <w:r>
@@ -199,7 +189,7 @@
         <w:t>main</w:t>
       </w:r>
       <w:r>
-        <w:t>.</w:t>
+        <w:t>. Bằng chứng CI có SHA riêng ở Chương 5 và không tự áp dụng cho thay đổi sau SHA đó.</w:t>
       </w:r>
     </w:p>
     <w:p>
@@ -1441,7 +1431,7 @@
         <w:t>REPEATABLE READ</w:t>
       </w:r>
       <w:r>
-        <w:t>. Chỉ mục GIN phục vụ full-text/trigram; kết quả xếp theo ISBN đúng, tựa đúng/tiền tố, full-text, tác giả, phần tên và tên gần đúng. Hai request ở hai trang khác thời điểm không mặc nhiên cùng snapshot. Query kiểm kê đọc snapshot đã lưu, không ghép các trang Copy sống rồi coi đó là một ảnh chụp thống nhất.</w:t>
+        <w:t>. Chỉ mục GIN phục vụ full-text/trigram; kết quả xếp theo ISBN đúng, tựa đúng/tiền tố, full-text, tác giả, phần tên và tên gần đúng. Khi không có kết quả và không kèm bộ lọc, giao diện có thể hiển thị tối đa năm nhan đề gần đúng để người đọc tự chọn tìm lại; đây là so khớp chữ, không phải hiểu ngữ nghĩa. Hai request ở hai trang khác thời điểm không mặc nhiên cùng snapshot. Query kiểm kê đọc snapshot đã lưu, không ghép các trang Copy sống rồi coi đó là một ảnh chụp thống nhất.</w:t>
       </w:r>
     </w:p>
     <w:p>

</xml_diff>

<commit_message>
Làm rõ vòng đời dữ liệu và cập nhật bằng chứng báo cáo
</commit_message>
<xml_diff>
--- a/ho-so-nop-bai/bao-cao/Bao-cao-tieu-luan-LAMS.docx
+++ b/ho-so-nop-bai/bao-cao/Bao-cao-tieu-luan-LAMS.docx
@@ -2690,10 +2690,20 @@
           <w:rFonts w:ascii="Consolas" w:hAnsi="Consolas"/>
           <w:sz w:val="20"/>
         </w:rPr>
-        <w:t>52606cc</w:t>
-      </w:r>
-      <w:r>
-        <w:t xml:space="preserve"> của nhánh làm việc đạt 5/5 job CI trong run 40652276931: Core, Node apps, API contracts, Web E2E và desktop Windows. Sau thay đổi offline, test </w:t>
+        <w:t>46c1916</w:t>
+      </w:r>
+      <w:r>
+        <w:t xml:space="preserve"> của nhánh làm việc đạt 5/5 job CI trong run 40667899756: Core (gồm PostgreSQL integration), Node apps, API contracts, Web E2E và desktop Windows. Artifact bộ cài </w:t>
+      </w:r>
+      <w:r>
+        <w:rPr>
+          <w:rFonts w:ascii="Consolas" w:hAnsi="Consolas"/>
+          <w:sz w:val="20"/>
+        </w:rPr>
+        <w:t>lams-windows-x64</w:t>
+      </w:r>
+      <w:r>
+        <w:t xml:space="preserve"> gắn với SHA này. Trước đó, test </w:t>
       </w:r>
       <w:r>
         <w:rPr>
@@ -2703,7 +2713,7 @@
         <w:t>InventoryFlow</w:t>
       </w:r>
       <w:r>
-        <w:t xml:space="preserve"> 8/8, typecheck và lint cũng đạt local. Test camera dùng mock </w:t>
+        <w:t xml:space="preserve"> 8/8, typecheck và lint đã đạt local; ở lần sửa tìm kiếm, 31 test frontend liên quan và năm test Node dữ liệu/đo lường đạt local. Test camera dùng mock </w:t>
       </w:r>
       <w:r>
         <w:rPr>
@@ -2723,7 +2733,17 @@
         <w:t>BarcodeDetector</w:t>
       </w:r>
       <w:r>
-        <w:t>; chưa có kết quả thử máy quét vật lý. Bản báo cáo được tạo sau commit này; nếu mã nguồn tiếp tục đổi, phải kiểm CI lại ở SHA nộp bài. Các con số của commit cũ không chứng minh chất lượng commit sau.</w:t>
+        <w:t xml:space="preserve">; chưa có kết quả thử máy quét vật lý. Bộ 25 câu hỏi tìm kiếm mới đã đối chiếu với snapshot Gutenberg nhưng chưa chạy phép đo API trên đủ 10.000 Book. Tài liệu này được cập nhật sau commit </w:t>
+      </w:r>
+      <w:r>
+        <w:rPr>
+          <w:rFonts w:ascii="Consolas" w:hAnsi="Consolas"/>
+          <w:sz w:val="20"/>
+        </w:rPr>
+        <w:t>46c1916</w:t>
+      </w:r>
+      <w:r>
+        <w:t>; thay đổi tiếp theo vẫn cần CI gắn SHA nộp bài.</w:t>
       </w:r>
     </w:p>
     <w:p>
@@ -2749,7 +2769,7 @@
     <w:p>
       <w:pPr/>
       <w:r>
-        <w:t>Lịch sử ISBN chỉ lưu UUID actor, ISBN, provider/status và thời gian, không lưu payload provider; hiện chưa có TTL/tự xóa khi tài khoản ngừng dùng. Báo cáo đánh giá, Inbox và quyết định no-show cũng chưa có retention đã phê duyệt. Không triển khai xóa dữ liệu production theo một mốc đề xuất chưa được chủ dữ liệu chấp thuận. Ảnh bìa/tác giả cần nguồn, giấy phép và ghi công; truy cập được qua API không đồng nghĩa được phép sao chép. Google Books mặc định tắt theo quyết định dự án.</w:t>
+        <w:t>Lịch sử ISBN chỉ lưu UUID actor, ISBN, provider/status và thời gian, không lưu payload provider; hiện chưa có TTL/tự xóa khi tài khoản ngừng dùng. Báo cáo đánh giá, Inbox và quyết định no-show cũng chưa có retention đã phê duyệt. Tài liệu vòng đời dữ liệu phân biệt khóa ngoại ở Core với UUID lưu xuyên dịch vụ ở Insight; truy vấn kiểm kê retention chỉ đếm số hàng và mốc thời gian, không xóa dữ liệu. Không triển khai xóa production theo một mốc đề xuất chưa được chủ dữ liệu chấp thuận. Ảnh bìa/tác giả cần nguồn, giấy phép và ghi công; truy cập được qua API không đồng nghĩa được phép sao chép. Google Books mặc định tắt theo quyết định dự án.</w:t>
       </w:r>
     </w:p>
     <w:p>
@@ -2769,7 +2789,7 @@
     <w:p>
       <w:pPr/>
       <w:r>
-        <w:t>LAMS đã có các luồng thư viện chính trên hai dịch vụ và giao diện Windows, với kiểm thử tự động theo nhiều lớp. Kết quả phù hợp để trình diễn trên môi trường phát triển, nhưng PR #31 còn draft và chưa được merge. Phần chưa hoàn tất của mục tiêu mở rộng gồm embedding/semantic search, hybrid ranking, cá nhân hóa có kiểm soát, zero-result analytics, dữ liệu nhu cầu theo thời gian cho Acquisition, ngân sách/đề xuất mua nội bộ, chính sách retention có phê duyệt và nghiệm thu pilot HTTPS. Các nội dung này không được trình bày như chức năng đã chạy.</w:t>
+        <w:t>LAMS đã có các luồng thư viện chính trên hai dịch vụ và giao diện Windows, với kiểm thử tự động theo nhiều lớp. Kết quả phù hợp để trình diễn trên môi trường phát triển; PR #31 đã sẵn sàng review nhưng chưa được merge. Phần chưa hoàn tất của mục tiêu mở rộng gồm embedding/semantic search, hybrid ranking, cá nhân hóa có kiểm soát, zero-result analytics, dữ liệu nhu cầu theo thời gian cho Acquisition, ngân sách/đề xuất mua nội bộ, chính sách retention có phê duyệt và nghiệm thu pilot HTTPS. Các nội dung này không được trình bày như chức năng đã chạy.</w:t>
       </w:r>
     </w:p>
     <w:p>

</xml_diff>

<commit_message>
Hoàn thiện giao diện sáng và lưu tùy chọn theo tài khoản
Thêm trang cài đặt giao diện với bản xem trước, preset an toàn và API Core lưu theo từng tài khoản. Bổ sung ảnh minh họa có nguồn rõ ràng, làm lại các vùng giới thiệu và cập nhật tài liệu cùng báo cáo. Kiểm thử frontend và hợp đồng API đã chạy tại local; bài test PostgreSQL mới chờ CI vì Docker Engine chưa sẵn sàng.
</commit_message>
<xml_diff>
--- a/ho-so-nop-bai/bao-cao/Bao-cao-tieu-luan-LAMS.docx
+++ b/ho-so-nop-bai/bao-cao/Bao-cao-tieu-luan-LAMS.docx
@@ -189,7 +189,7 @@
         <w:t>main</w:t>
       </w:r>
       <w:r>
-        <w:t>. Bằng chứng CI có SHA riêng ở Chương 5 và không tự áp dụng cho thay đổi sau SHA đó.</w:t>
+        <w:t>. Bằng chứng CI có SHA riêng ở mục 4.2 và không tự áp dụng cho thay đổi sau SHA đó.</w:t>
       </w:r>
     </w:p>
     <w:p>
@@ -2754,28 +2754,58 @@
     </w:p>
     <w:p>
       <w:pPr>
-        <w:pStyle w:val="Heading1"/>
+        <w:pStyle w:val="Heading2"/>
       </w:pPr>
       <w:r>
-        <w:t>Chương 5. An ninh, pháp luật và đạo đức</w:t>
+        <w:t>4.3. Giao diện và nguồn ảnh</w:t>
       </w:r>
     </w:p>
     <w:p>
       <w:pPr/>
       <w:r>
-        <w:t>Auth giữ access JWT trong memory, refresh token trong cookie HttpOnly; role/owner được server xác định thay vì tin body. Query SQL dùng tham số; Prisma không ghép raw SQL từ request. Validation giới hạn độ dài, phân trang và ISBN; media ngoài được duyệt thủ công trước khi hiển thị. Hệ thống có test 401/403/404/409/422/429/503, nhưng CI và quét dependency không thể chứng minh tuyệt đối rằng không còn lỗ hổng. Bản pilot có dữ liệu thật cần kiểm HTTPS, secret, backup, retention, bảo vệ ingress và rate limit dùng chung nhiều replica.</w:t>
+        <w:t xml:space="preserve">Nhánh làm việc sau SHA </w:t>
+      </w:r>
+      <w:r>
+        <w:rPr>
+          <w:rFonts w:ascii="Consolas" w:hAnsi="Consolas"/>
+          <w:sz w:val="20"/>
+        </w:rPr>
+        <w:t>504499b</w:t>
+      </w:r>
+      <w:r>
+        <w:t xml:space="preserve"> bổ sung bố cục sáng với sidebar tách khỏi vùng làm việc, các bề mặt có độ trong vừa phải và trang </w:t>
+      </w:r>
+      <w:r>
+        <w:rPr>
+          <w:rFonts w:ascii="Consolas" w:hAnsi="Consolas"/>
+          <w:sz w:val="20"/>
+        </w:rPr>
+        <w:t>/cai-dat/giao-dien</w:t>
+      </w:r>
+      <w:r>
+        <w:t>. Người dùng chọn màu nhấn, blur, độ bo góc, mật độ, cỡ chữ, chuyển động, kiểu hiển thị sách và trạng thái sidebar rồi xem trước trước khi lưu. Khách lưu trong trình duyệt; người đăng nhập lưu preset theo tài khoản qua Core. API chỉ nhận các giá trị trong danh sách cho phép, có phiên bản schema và revision để tránh ghi đè khi hai thiết bị cùng sửa. Các khối trên bảng điều khiển nhân viên có thể được ẩn hoặc hiện; số liệu vẫn đọc từ API thật.</w:t>
       </w:r>
     </w:p>
     <w:p>
       <w:pPr/>
       <w:r>
-        <w:t>Lịch sử ISBN chỉ lưu UUID actor, ISBN, provider/status và thời gian, không lưu payload provider; hiện chưa có TTL/tự xóa khi tài khoản ngừng dùng. Báo cáo đánh giá, Inbox và quyết định no-show cũng chưa có retention đã phê duyệt. Tài liệu vòng đời dữ liệu phân biệt khóa ngoại ở Core với UUID lưu xuyên dịch vụ ở Insight; truy vấn kiểm kê retention chỉ đếm số hàng và mốc thời gian, không xóa dữ liệu. Không triển khai xóa production theo một mốc đề xuất chưa được chủ dữ liệu chấp thuận. Ảnh bìa/tác giả cần nguồn, giấy phép và ghi công; truy cập được qua API không đồng nghĩa được phép sao chép. Google Books mặc định tắt theo quyết định dự án.</w:t>
+        <w:t xml:space="preserve">Ảnh thư viện ở trang chủ và đăng nhập là ảnh nhóm đã cung cấp. Ba ảnh Pexels mới được lưu cục bộ cho đầu trang Catalog, trang tác giả/thể loại và khối giới thiệu hành trình đọc. Bảng nguồn ảnh nằm trong </w:t>
+      </w:r>
+      <w:r>
+        <w:rPr>
+          <w:rFonts w:ascii="Consolas" w:hAnsi="Consolas"/>
+          <w:sz w:val="20"/>
+        </w:rPr>
+        <w:t>tai-lieu/06-giao-dien/nguon-anh.md</w:t>
+      </w:r>
+      <w:r>
+        <w:t>. Ảnh minh họa không được gán thành chân dung tác giả hoặc bìa sách. Khi chưa có media đã duyệt, card dùng thiết kế chữ và nhãn đúng trạng thái. URL media Catalog đã duyệt vẫn được tải trực tiếp từ nguồn; việc sao chép toàn bộ ảnh này về máy chủ chưa nằm trong thay đổi giao diện.</w:t>
       </w:r>
     </w:p>
     <w:p>
       <w:pPr/>
       <w:r>
-        <w:t>Nhóm cần rà nghĩa vụ theo Luật Bảo vệ dữ liệu cá nhân 91/2025/QH15 và Luật 07/2022/QH15 sửa đổi Luật Sở hữu trí tuệ trước khi vận hành dữ liệu thật hoặc phát hành asset. Đây là căn cứ tham khảo, không phải kết luận tuân thủ pháp luật. Về đạo đức nghề nghiệp, nhóm phải giữ chính xác tác giả commit, không dùng dữ liệu cá nhân thật trong video khi chưa có quyền, công khai giới hạn kiểm thử và không tự động phạt người đọc từ tín hiệu có thể sai. Mức sử dụng công cụ hỗ trợ trong học phần cần được thành viên khai báo theo quy định thực tế của giảng viên; báo cáo không tự suy sự chấp thuận đó.</w:t>
+        <w:t>Ở lượt kiểm tra local ngày 28/10/2026, frontend đạt 187/187 test và chụp trang cài đặt ở 390, 768, 1440 px không có cuộn ngang; trang chủ 1440 px cũng không tràn. Core biên dịch được mã nguồn và mã test, nhưng Docker Engine chưa chạy nên test PostgreSQL của migration và API mới chưa có kết quả local. CI và E2E Web/EXE của commit bàn giao mới phải được ghi riêng sau khi chạy; bằng chứng ở mục 4.2 không áp dụng cho thay đổi này.</w:t>
       </w:r>
     </w:p>
     <w:p>
@@ -2783,13 +2813,39 @@
         <w:pStyle w:val="Heading1"/>
       </w:pPr>
       <w:r>
-        <w:t>Chương 6. Kết luận và việc còn lại</w:t>
+        <w:t>Chương 5. An ninh, pháp luật và đạo đức</w:t>
       </w:r>
     </w:p>
     <w:p>
       <w:pPr/>
       <w:r>
-        <w:t>LAMS đã có các luồng thư viện chính trên hai dịch vụ và giao diện Windows, với kiểm thử tự động theo nhiều lớp. Kết quả phù hợp để trình diễn trên môi trường phát triển; PR #31 đã sẵn sàng review nhưng chưa được merge. Phần chưa hoàn tất của mục tiêu mở rộng gồm embedding/semantic search, hybrid ranking, cá nhân hóa có kiểm soát, zero-result analytics, dữ liệu nhu cầu theo thời gian cho Acquisition, ngân sách/đề xuất mua nội bộ, chính sách retention có phê duyệt và nghiệm thu pilot HTTPS. Các nội dung này không được trình bày như chức năng đã chạy.</w:t>
+        <w:t>Auth giữ access JWT trong memory, refresh token trong cookie HttpOnly; role/owner được server xác định thay vì tin body. Query SQL dùng tham số; Prisma không ghép raw SQL từ request. Validation giới hạn độ dài, phân trang và ISBN; media ngoài được duyệt thủ công trước khi hiển thị. Hệ thống có test 401/403/404/409/422/429/503, nhưng CI và quét dependency không thể chứng minh tuyệt đối rằng không còn lỗ hổng. Bản pilot có dữ liệu thật cần kiểm HTTPS, secret, backup, retention, bảo vệ ingress và rate limit dùng chung nhiều replica.</w:t>
+      </w:r>
+    </w:p>
+    <w:p>
+      <w:pPr/>
+      <w:r>
+        <w:t>Lịch sử ISBN chỉ lưu UUID actor, ISBN, provider/status và thời gian, không lưu payload provider; hiện chưa có TTL/tự xóa khi tài khoản ngừng dùng. Báo cáo đánh giá, Inbox và quyết định no-show cũng chưa có retention đã phê duyệt. Tài liệu vòng đời dữ liệu phân biệt khóa ngoại ở Core với UUID lưu xuyên dịch vụ ở Insight; truy vấn kiểm kê retention chỉ đếm số hàng và mốc thời gian, không xóa dữ liệu. Không triển khai xóa production theo một mốc đề xuất chưa được chủ dữ liệu chấp thuận. Ảnh bìa/tác giả cần nguồn, giấy phép và ghi công; truy cập được qua API không đồng nghĩa được phép sao chép. Google Books mặc định tắt theo quyết định dự án.</w:t>
+      </w:r>
+    </w:p>
+    <w:p>
+      <w:pPr/>
+      <w:r>
+        <w:t>Nhóm cần rà nghĩa vụ theo Luật Bảo vệ dữ liệu cá nhân 91/2025/QH15 và Luật 07/2022/QH15 sửa đổi Luật Sở hữu trí tuệ trước khi vận hành dữ liệu thật hoặc phát hành asset. Đây là căn cứ tham khảo, không phải kết luận tuân thủ pháp luật. Về đạo đức nghề nghiệp, nhóm phải giữ chính xác tác giả commit, không dùng dữ liệu cá nhân thật trong video khi chưa có quyền, công khai giới hạn kiểm thử và không tự động phạt người đọc từ tín hiệu có thể sai. Mức sử dụng công cụ hỗ trợ trong học phần cần được thành viên khai báo theo quy định thực tế của giảng viên; báo cáo không tự suy sự chấp thuận đó.</w:t>
+      </w:r>
+    </w:p>
+    <w:p>
+      <w:pPr>
+        <w:pStyle w:val="Heading1"/>
+      </w:pPr>
+      <w:r>
+        <w:t>Chương 6. Kết luận và việc còn lại</w:t>
+      </w:r>
+    </w:p>
+    <w:p>
+      <w:pPr/>
+      <w:r>
+        <w:t>LAMS đã có các luồng thư viện chính trên hai dịch vụ và giao diện Windows, với kiểm thử tự động theo nhiều lớp. Kết quả phù hợp để trình diễn trên môi trường phát triển; PR #31 vẫn là bản làm việc chưa được merge. Phần chưa hoàn tất của mục tiêu mở rộng gồm embedding/semantic search, hybrid ranking, cá nhân hóa gợi ý sách, zero-result analytics, dữ liệu nhu cầu theo thời gian cho Acquisition, ngân sách/đề xuất mua nội bộ, chính sách retention có phê duyệt và nghiệm thu pilot HTTPS. Các nội dung này không được trình bày như chức năng đã chạy. Tùy chỉnh giao diện ở mục 4.3 là thiết lập trình bày, không phải thuật toán gợi ý sách.</w:t>
       </w:r>
     </w:p>
     <w:p>

</xml_diff>

<commit_message>
Bổ sung ảnh minh họa thể loại và sửa kiểm thử migration
</commit_message>
<xml_diff>
--- a/ho-so-nop-bai/bao-cao/Bao-cao-tieu-luan-LAMS.docx
+++ b/ho-so-nop-bai/bao-cao/Bao-cao-tieu-luan-LAMS.docx
@@ -2789,7 +2789,7 @@
     <w:p>
       <w:pPr/>
       <w:r>
-        <w:t xml:space="preserve">Ảnh thư viện ở trang chủ và đăng nhập là ảnh nhóm đã cung cấp. Ba ảnh Pexels mới được lưu cục bộ cho đầu trang Catalog, trang tác giả/thể loại và khối giới thiệu hành trình đọc. Bảng nguồn ảnh nằm trong </w:t>
+        <w:t xml:space="preserve">Ảnh thư viện ở trang chủ và đăng nhập là ảnh nhóm đã cung cấp. Chín ảnh Pexels mới được lưu cục bộ: ba ảnh cho đầu trang Catalog, trang tác giả/thể loại, khối giới thiệu hành trình đọc; sáu ảnh minh họa cho các nhóm thể loại đã ánh xạ. Bảng nguồn ảnh nằm trong </w:t>
       </w:r>
       <w:r>
         <w:rPr>
@@ -2799,7 +2799,7 @@
         <w:t>tai-lieu/06-giao-dien/nguon-anh.md</w:t>
       </w:r>
       <w:r>
-        <w:t>. Ảnh minh họa không được gán thành chân dung tác giả hoặc bìa sách. Khi chưa có media đã duyệt, card dùng thiết kế chữ và nhãn đúng trạng thái. URL media Catalog đã duyệt vẫn được tải trực tiếp từ nguồn; việc sao chép toàn bộ ảnh này về máy chủ chưa nằm trong thay đổi giao diện.</w:t>
+        <w:t>. Ảnh minh họa được ghi nhãn riêng, không gán thành chân dung tác giả hoặc bìa sách. Khi chưa có media đã duyệt và không có chủ đề phù hợp, card dùng thiết kế chữ và nhãn đúng trạng thái. URL media Catalog đã duyệt vẫn được tải trực tiếp từ nguồn; việc sao chép toàn bộ ảnh này về máy chủ chưa nằm trong thay đổi giao diện.</w:t>
       </w:r>
     </w:p>
     <w:p>

</xml_diff>

<commit_message>
Bổ sung sơ đồ miền và kiểm kê bảng dữ liệu trong báo cáo
</commit_message>
<xml_diff>
--- a/ho-so-nop-bai/bao-cao/Bao-cao-tieu-luan-LAMS.docx
+++ b/ho-so-nop-bai/bao-cao/Bao-cao-tieu-luan-LAMS.docx
@@ -315,7 +315,7 @@
       <w:pPr>
         <w:pStyle w:val="Heading1"/>
       </w:pPr>
-      <w:bookmarkStart w:id="0" w:name="_Toc244113354"/>
+      <w:bookmarkStart w:id="0" w:name="_Toc244113862"/>
       <w:r>
         <w:lastRenderedPageBreak/>
         <w:t>Báo cáo ti</w:t>
@@ -632,7 +632,7 @@
       <w:pPr>
         <w:pStyle w:val="Heading1"/>
       </w:pPr>
-      <w:bookmarkStart w:id="1" w:name="_Toc244113355"/>
+      <w:bookmarkStart w:id="1" w:name="_Toc244113863"/>
       <w:r>
         <w:t>Tóm t</w:t>
       </w:r>
@@ -1505,7 +1505,7 @@
       <w:pPr>
         <w:pStyle w:val="Heading1"/>
       </w:pPr>
-      <w:bookmarkStart w:id="2" w:name="_Toc244113356"/>
+      <w:bookmarkStart w:id="2" w:name="_Toc244113864"/>
       <w:r>
         <w:t>M</w:t>
       </w:r>
@@ -1548,7 +1548,7 @@
       <w:r>
         <w:fldChar w:fldCharType="separate"/>
       </w:r>
-      <w:hyperlink w:anchor="_Toc244113354" w:history="1">
+      <w:hyperlink w:anchor="_Toc244113862" w:history="1">
         <w:r>
           <w:rPr>
             <w:rStyle w:val="Hyperlink"/>
@@ -1575,7 +1575,7 @@
             <w:noProof/>
             <w:webHidden/>
           </w:rPr>
-          <w:instrText xml:space="preserve"> PAGEREF _Toc244113354 \h </w:instrText>
+          <w:instrText xml:space="preserve"> PAGEREF _Toc244113862 \h </w:instrText>
         </w:r>
         <w:r>
           <w:rPr>
@@ -1622,7 +1622,7 @@
           <w14:ligatures w14:val="standardContextual"/>
         </w:rPr>
       </w:pPr>
-      <w:hyperlink w:anchor="_Toc244113355" w:history="1">
+      <w:hyperlink w:anchor="_Toc244113863" w:history="1">
         <w:r>
           <w:rPr>
             <w:rStyle w:val="Hyperlink"/>
@@ -1649,7 +1649,7 @@
             <w:noProof/>
             <w:webHidden/>
           </w:rPr>
-          <w:instrText xml:space="preserve"> PAGEREF _Toc244113355 \h </w:instrText>
+          <w:instrText xml:space="preserve"> PAGEREF _Toc244113863 \h </w:instrText>
         </w:r>
         <w:r>
           <w:rPr>
@@ -1696,7 +1696,7 @@
           <w14:ligatures w14:val="standardContextual"/>
         </w:rPr>
       </w:pPr>
-      <w:hyperlink w:anchor="_Toc244113356" w:history="1">
+      <w:hyperlink w:anchor="_Toc244113864" w:history="1">
         <w:r>
           <w:rPr>
             <w:rStyle w:val="Hyperlink"/>
@@ -1723,7 +1723,7 @@
             <w:noProof/>
             <w:webHidden/>
           </w:rPr>
-          <w:instrText xml:space="preserve"> PAGEREF _Toc244113356 \h </w:instrText>
+          <w:instrText xml:space="preserve"> PAGEREF _Toc244113864 \h </w:instrText>
         </w:r>
         <w:r>
           <w:rPr>
@@ -1770,7 +1770,7 @@
           <w14:ligatures w14:val="standardContextual"/>
         </w:rPr>
       </w:pPr>
-      <w:hyperlink w:anchor="_Toc244113357" w:history="1">
+      <w:hyperlink w:anchor="_Toc244113865" w:history="1">
         <w:r>
           <w:rPr>
             <w:rStyle w:val="Hyperlink"/>
@@ -1797,7 +1797,7 @@
             <w:noProof/>
             <w:webHidden/>
           </w:rPr>
-          <w:instrText xml:space="preserve"> PAGEREF _Toc244113357 \h </w:instrText>
+          <w:instrText xml:space="preserve"> PAGEREF _Toc244113865 \h </w:instrText>
         </w:r>
         <w:r>
           <w:rPr>
@@ -1844,7 +1844,7 @@
           <w14:ligatures w14:val="standardContextual"/>
         </w:rPr>
       </w:pPr>
-      <w:hyperlink w:anchor="_Toc244113358" w:history="1">
+      <w:hyperlink w:anchor="_Toc244113866" w:history="1">
         <w:r>
           <w:rPr>
             <w:rStyle w:val="Hyperlink"/>
@@ -1871,7 +1871,7 @@
             <w:noProof/>
             <w:webHidden/>
           </w:rPr>
-          <w:instrText xml:space="preserve"> PAGEREF _Toc244113358 \h </w:instrText>
+          <w:instrText xml:space="preserve"> PAGEREF _Toc244113866 \h </w:instrText>
         </w:r>
         <w:r>
           <w:rPr>
@@ -1918,7 +1918,7 @@
           <w14:ligatures w14:val="standardContextual"/>
         </w:rPr>
       </w:pPr>
-      <w:hyperlink w:anchor="_Toc244113359" w:history="1">
+      <w:hyperlink w:anchor="_Toc244113867" w:history="1">
         <w:r>
           <w:rPr>
             <w:rStyle w:val="Hyperlink"/>
@@ -1945,7 +1945,7 @@
             <w:noProof/>
             <w:webHidden/>
           </w:rPr>
-          <w:instrText xml:space="preserve"> PAGEREF _Toc244113359 \h </w:instrText>
+          <w:instrText xml:space="preserve"> PAGEREF _Toc244113867 \h </w:instrText>
         </w:r>
         <w:r>
           <w:rPr>
@@ -1992,7 +1992,7 @@
           <w14:ligatures w14:val="standardContextual"/>
         </w:rPr>
       </w:pPr>
-      <w:hyperlink w:anchor="_Toc244113360" w:history="1">
+      <w:hyperlink w:anchor="_Toc244113868" w:history="1">
         <w:r>
           <w:rPr>
             <w:rStyle w:val="Hyperlink"/>
@@ -2019,7 +2019,7 @@
             <w:noProof/>
             <w:webHidden/>
           </w:rPr>
-          <w:instrText xml:space="preserve"> PAGEREF _Toc244113360 \h </w:instrText>
+          <w:instrText xml:space="preserve"> PAGEREF _Toc244113868 \h </w:instrText>
         </w:r>
         <w:r>
           <w:rPr>
@@ -2066,7 +2066,7 @@
           <w14:ligatures w14:val="standardContextual"/>
         </w:rPr>
       </w:pPr>
-      <w:hyperlink w:anchor="_Toc244113361" w:history="1">
+      <w:hyperlink w:anchor="_Toc244113869" w:history="1">
         <w:r>
           <w:rPr>
             <w:rStyle w:val="Hyperlink"/>
@@ -2093,7 +2093,7 @@
             <w:noProof/>
             <w:webHidden/>
           </w:rPr>
-          <w:instrText xml:space="preserve"> PAGEREF _Toc244113361 \h </w:instrText>
+          <w:instrText xml:space="preserve"> PAGEREF _Toc244113869 \h </w:instrText>
         </w:r>
         <w:r>
           <w:rPr>
@@ -2140,7 +2140,7 @@
           <w14:ligatures w14:val="standardContextual"/>
         </w:rPr>
       </w:pPr>
-      <w:hyperlink w:anchor="_Toc244113362" w:history="1">
+      <w:hyperlink w:anchor="_Toc244113870" w:history="1">
         <w:r>
           <w:rPr>
             <w:rStyle w:val="Hyperlink"/>
@@ -2167,7 +2167,7 @@
             <w:noProof/>
             <w:webHidden/>
           </w:rPr>
-          <w:instrText xml:space="preserve"> PAGEREF _Toc244113362 \h </w:instrText>
+          <w:instrText xml:space="preserve"> PAGEREF _Toc244113870 \h </w:instrText>
         </w:r>
         <w:r>
           <w:rPr>
@@ -2214,7 +2214,7 @@
           <w14:ligatures w14:val="standardContextual"/>
         </w:rPr>
       </w:pPr>
-      <w:hyperlink w:anchor="_Toc244113363" w:history="1">
+      <w:hyperlink w:anchor="_Toc244113871" w:history="1">
         <w:r>
           <w:rPr>
             <w:rStyle w:val="Hyperlink"/>
@@ -2241,7 +2241,7 @@
             <w:noProof/>
             <w:webHidden/>
           </w:rPr>
-          <w:instrText xml:space="preserve"> PAGEREF _Toc244113363 \h </w:instrText>
+          <w:instrText xml:space="preserve"> PAGEREF _Toc244113871 \h </w:instrText>
         </w:r>
         <w:r>
           <w:rPr>
@@ -2288,7 +2288,7 @@
           <w14:ligatures w14:val="standardContextual"/>
         </w:rPr>
       </w:pPr>
-      <w:hyperlink w:anchor="_Toc244113364" w:history="1">
+      <w:hyperlink w:anchor="_Toc244113872" w:history="1">
         <w:r>
           <w:rPr>
             <w:rStyle w:val="Hyperlink"/>
@@ -2315,7 +2315,7 @@
             <w:noProof/>
             <w:webHidden/>
           </w:rPr>
-          <w:instrText xml:space="preserve"> PAGEREF _Toc244113364 \h </w:instrText>
+          <w:instrText xml:space="preserve"> PAGEREF _Toc244113872 \h </w:instrText>
         </w:r>
         <w:r>
           <w:rPr>
@@ -2362,7 +2362,7 @@
           <w14:ligatures w14:val="standardContextual"/>
         </w:rPr>
       </w:pPr>
-      <w:hyperlink w:anchor="_Toc244113365" w:history="1">
+      <w:hyperlink w:anchor="_Toc244113873" w:history="1">
         <w:r>
           <w:rPr>
             <w:rStyle w:val="Hyperlink"/>
@@ -2389,7 +2389,7 @@
             <w:noProof/>
             <w:webHidden/>
           </w:rPr>
-          <w:instrText xml:space="preserve"> PAGEREF _Toc244113365 \h </w:instrText>
+          <w:instrText xml:space="preserve"> PAGEREF _Toc244113873 \h </w:instrText>
         </w:r>
         <w:r>
           <w:rPr>
@@ -2436,7 +2436,7 @@
           <w14:ligatures w14:val="standardContextual"/>
         </w:rPr>
       </w:pPr>
-      <w:hyperlink w:anchor="_Toc244113366" w:history="1">
+      <w:hyperlink w:anchor="_Toc244113874" w:history="1">
         <w:r>
           <w:rPr>
             <w:rStyle w:val="Hyperlink"/>
@@ -2463,7 +2463,7 @@
             <w:noProof/>
             <w:webHidden/>
           </w:rPr>
-          <w:instrText xml:space="preserve"> PAGEREF _Toc244113366 \h </w:instrText>
+          <w:instrText xml:space="preserve"> PAGEREF _Toc244113874 \h </w:instrText>
         </w:r>
         <w:r>
           <w:rPr>
@@ -2510,7 +2510,7 @@
           <w14:ligatures w14:val="standardContextual"/>
         </w:rPr>
       </w:pPr>
-      <w:hyperlink w:anchor="_Toc244113367" w:history="1">
+      <w:hyperlink w:anchor="_Toc244113875" w:history="1">
         <w:r>
           <w:rPr>
             <w:rStyle w:val="Hyperlink"/>
@@ -2537,7 +2537,7 @@
             <w:noProof/>
             <w:webHidden/>
           </w:rPr>
-          <w:instrText xml:space="preserve"> PAGEREF _Toc244113367 \h </w:instrText>
+          <w:instrText xml:space="preserve"> PAGEREF _Toc244113875 \h </w:instrText>
         </w:r>
         <w:r>
           <w:rPr>
@@ -2584,7 +2584,7 @@
           <w14:ligatures w14:val="standardContextual"/>
         </w:rPr>
       </w:pPr>
-      <w:hyperlink w:anchor="_Toc244113368" w:history="1">
+      <w:hyperlink w:anchor="_Toc244113876" w:history="1">
         <w:r>
           <w:rPr>
             <w:rStyle w:val="Hyperlink"/>
@@ -2611,7 +2611,7 @@
             <w:noProof/>
             <w:webHidden/>
           </w:rPr>
-          <w:instrText xml:space="preserve"> PAGEREF _Toc244113368 \h </w:instrText>
+          <w:instrText xml:space="preserve"> PAGEREF _Toc244113876 \h </w:instrText>
         </w:r>
         <w:r>
           <w:rPr>
@@ -2658,7 +2658,7 @@
           <w14:ligatures w14:val="standardContextual"/>
         </w:rPr>
       </w:pPr>
-      <w:hyperlink w:anchor="_Toc244113369" w:history="1">
+      <w:hyperlink w:anchor="_Toc244113877" w:history="1">
         <w:r>
           <w:rPr>
             <w:rStyle w:val="Hyperlink"/>
@@ -2685,7 +2685,7 @@
             <w:noProof/>
             <w:webHidden/>
           </w:rPr>
-          <w:instrText xml:space="preserve"> PAGEREF _Toc244113369 \h </w:instrText>
+          <w:instrText xml:space="preserve"> PAGEREF _Toc244113877 \h </w:instrText>
         </w:r>
         <w:r>
           <w:rPr>
@@ -2732,7 +2732,7 @@
           <w14:ligatures w14:val="standardContextual"/>
         </w:rPr>
       </w:pPr>
-      <w:hyperlink w:anchor="_Toc244113370" w:history="1">
+      <w:hyperlink w:anchor="_Toc244113878" w:history="1">
         <w:r>
           <w:rPr>
             <w:rStyle w:val="Hyperlink"/>
@@ -2759,7 +2759,7 @@
             <w:noProof/>
             <w:webHidden/>
           </w:rPr>
-          <w:instrText xml:space="preserve"> PAGEREF _Toc244113370 \h </w:instrText>
+          <w:instrText xml:space="preserve"> PAGEREF _Toc244113878 \h </w:instrText>
         </w:r>
         <w:r>
           <w:rPr>
@@ -2806,7 +2806,7 @@
           <w14:ligatures w14:val="standardContextual"/>
         </w:rPr>
       </w:pPr>
-      <w:hyperlink w:anchor="_Toc244113371" w:history="1">
+      <w:hyperlink w:anchor="_Toc244113879" w:history="1">
         <w:r>
           <w:rPr>
             <w:rStyle w:val="Hyperlink"/>
@@ -2833,7 +2833,7 @@
             <w:noProof/>
             <w:webHidden/>
           </w:rPr>
-          <w:instrText xml:space="preserve"> PAGEREF _Toc244113371 \h </w:instrText>
+          <w:instrText xml:space="preserve"> PAGEREF _Toc244113879 \h </w:instrText>
         </w:r>
         <w:r>
           <w:rPr>
@@ -2880,7 +2880,7 @@
           <w14:ligatures w14:val="standardContextual"/>
         </w:rPr>
       </w:pPr>
-      <w:hyperlink w:anchor="_Toc244113372" w:history="1">
+      <w:hyperlink w:anchor="_Toc244113880" w:history="1">
         <w:r>
           <w:rPr>
             <w:rStyle w:val="Hyperlink"/>
@@ -2907,7 +2907,7 @@
             <w:noProof/>
             <w:webHidden/>
           </w:rPr>
-          <w:instrText xml:space="preserve"> PAGEREF _Toc244113372 \h </w:instrText>
+          <w:instrText xml:space="preserve"> PAGEREF _Toc244113880 \h </w:instrText>
         </w:r>
         <w:r>
           <w:rPr>
@@ -2954,7 +2954,7 @@
           <w14:ligatures w14:val="standardContextual"/>
         </w:rPr>
       </w:pPr>
-      <w:hyperlink w:anchor="_Toc244113373" w:history="1">
+      <w:hyperlink w:anchor="_Toc244113881" w:history="1">
         <w:r>
           <w:rPr>
             <w:rStyle w:val="Hyperlink"/>
@@ -2981,7 +2981,7 @@
             <w:noProof/>
             <w:webHidden/>
           </w:rPr>
-          <w:instrText xml:space="preserve"> PAGEREF _Toc244113373 \h </w:instrText>
+          <w:instrText xml:space="preserve"> PAGEREF _Toc244113881 \h </w:instrText>
         </w:r>
         <w:r>
           <w:rPr>
@@ -3028,7 +3028,7 @@
           <w14:ligatures w14:val="standardContextual"/>
         </w:rPr>
       </w:pPr>
-      <w:hyperlink w:anchor="_Toc244113374" w:history="1">
+      <w:hyperlink w:anchor="_Toc244113882" w:history="1">
         <w:r>
           <w:rPr>
             <w:rStyle w:val="Hyperlink"/>
@@ -3055,7 +3055,7 @@
             <w:noProof/>
             <w:webHidden/>
           </w:rPr>
-          <w:instrText xml:space="preserve"> PAGEREF _Toc244113374 \h </w:instrText>
+          <w:instrText xml:space="preserve"> PAGEREF _Toc244113882 \h </w:instrText>
         </w:r>
         <w:r>
           <w:rPr>
@@ -3102,7 +3102,7 @@
           <w14:ligatures w14:val="standardContextual"/>
         </w:rPr>
       </w:pPr>
-      <w:hyperlink w:anchor="_Toc244113375" w:history="1">
+      <w:hyperlink w:anchor="_Toc244113883" w:history="1">
         <w:r>
           <w:rPr>
             <w:rStyle w:val="Hyperlink"/>
@@ -3129,81 +3129,7 @@
             <w:noProof/>
             <w:webHidden/>
           </w:rPr>
-          <w:instrText xml:space="preserve"> PAGEREF _Toc244113375 \h </w:instrText>
-        </w:r>
-        <w:r>
-          <w:rPr>
-            <w:noProof/>
-            <w:webHidden/>
-          </w:rPr>
-        </w:r>
-        <w:r>
-          <w:rPr>
-            <w:noProof/>
-            <w:webHidden/>
-          </w:rPr>
-          <w:fldChar w:fldCharType="separate"/>
-        </w:r>
-        <w:r>
-          <w:rPr>
-            <w:noProof/>
-            <w:webHidden/>
-          </w:rPr>
-          <w:t>17</w:t>
-        </w:r>
-        <w:r>
-          <w:rPr>
-            <w:noProof/>
-            <w:webHidden/>
-          </w:rPr>
-          <w:fldChar w:fldCharType="end"/>
-        </w:r>
-      </w:hyperlink>
-    </w:p>
-    <w:p>
-      <w:pPr>
-        <w:pStyle w:val="TOC2"/>
-        <w:tabs>
-          <w:tab w:val="right" w:leader="dot" w:pos="9288"/>
-        </w:tabs>
-        <w:rPr>
-          <w:rFonts w:asciiTheme="minorHAnsi" w:hAnsiTheme="minorHAnsi"/>
-          <w:noProof/>
-          <w:color w:val="auto"/>
-          <w:kern w:val="2"/>
-          <w:sz w:val="24"/>
-          <w:szCs w:val="24"/>
-          <w14:ligatures w14:val="standardContextual"/>
-        </w:rPr>
-      </w:pPr>
-      <w:hyperlink w:anchor="_Toc244113376" w:history="1">
-        <w:r>
-          <w:rPr>
-            <w:rStyle w:val="Hyperlink"/>
-            <w:noProof/>
-          </w:rPr>
-          <w:t>4.3. Triển khai local và giới hạn production</w:t>
-        </w:r>
-        <w:r>
-          <w:rPr>
-            <w:noProof/>
-            <w:webHidden/>
-          </w:rPr>
-          <w:tab/>
-        </w:r>
-        <w:r>
-          <w:rPr>
-            <w:noProof/>
-            <w:webHidden/>
-          </w:rPr>
-          <w:fldChar w:fldCharType="begin"/>
-        </w:r>
-        <w:r>
-          <w:rPr>
-            <w:noProof/>
-            <w:webHidden/>
-          </w:rPr>
-          <w:instrText xml:space="preserve"> PAGEREF _Toc244113376 \h </w:instrText>
+          <w:instrText xml:space="preserve"> PAGEREF _Toc244113883 \h </w:instrText>
         </w:r>
         <w:r>
           <w:rPr>
@@ -3250,7 +3176,81 @@
           <w14:ligatures w14:val="standardContextual"/>
         </w:rPr>
       </w:pPr>
-      <w:hyperlink w:anchor="_Toc244113377" w:history="1">
+      <w:hyperlink w:anchor="_Toc244113884" w:history="1">
+        <w:r>
+          <w:rPr>
+            <w:rStyle w:val="Hyperlink"/>
+            <w:noProof/>
+          </w:rPr>
+          <w:t>4.3. Triển khai local và giới hạn production</w:t>
+        </w:r>
+        <w:r>
+          <w:rPr>
+            <w:noProof/>
+            <w:webHidden/>
+          </w:rPr>
+          <w:tab/>
+        </w:r>
+        <w:r>
+          <w:rPr>
+            <w:noProof/>
+            <w:webHidden/>
+          </w:rPr>
+          <w:fldChar w:fldCharType="begin"/>
+        </w:r>
+        <w:r>
+          <w:rPr>
+            <w:noProof/>
+            <w:webHidden/>
+          </w:rPr>
+          <w:instrText xml:space="preserve"> PAGEREF _Toc244113884 \h </w:instrText>
+        </w:r>
+        <w:r>
+          <w:rPr>
+            <w:noProof/>
+            <w:webHidden/>
+          </w:rPr>
+        </w:r>
+        <w:r>
+          <w:rPr>
+            <w:noProof/>
+            <w:webHidden/>
+          </w:rPr>
+          <w:fldChar w:fldCharType="separate"/>
+        </w:r>
+        <w:r>
+          <w:rPr>
+            <w:noProof/>
+            <w:webHidden/>
+          </w:rPr>
+          <w:t>19</w:t>
+        </w:r>
+        <w:r>
+          <w:rPr>
+            <w:noProof/>
+            <w:webHidden/>
+          </w:rPr>
+          <w:fldChar w:fldCharType="end"/>
+        </w:r>
+      </w:hyperlink>
+    </w:p>
+    <w:p>
+      <w:pPr>
+        <w:pStyle w:val="TOC2"/>
+        <w:tabs>
+          <w:tab w:val="right" w:leader="dot" w:pos="9288"/>
+        </w:tabs>
+        <w:rPr>
+          <w:rFonts w:asciiTheme="minorHAnsi" w:hAnsiTheme="minorHAnsi"/>
+          <w:noProof/>
+          <w:color w:val="auto"/>
+          <w:kern w:val="2"/>
+          <w:sz w:val="24"/>
+          <w:szCs w:val="24"/>
+          <w14:ligatures w14:val="standardContextual"/>
+        </w:rPr>
+      </w:pPr>
+      <w:hyperlink w:anchor="_Toc244113885" w:history="1">
         <w:r>
           <w:rPr>
             <w:rStyle w:val="Hyperlink"/>
@@ -3277,7 +3277,7 @@
             <w:noProof/>
             <w:webHidden/>
           </w:rPr>
-          <w:instrText xml:space="preserve"> PAGEREF _Toc244113377 \h </w:instrText>
+          <w:instrText xml:space="preserve"> PAGEREF _Toc244113885 \h </w:instrText>
         </w:r>
         <w:r>
           <w:rPr>
@@ -3324,7 +3324,7 @@
           <w14:ligatures w14:val="standardContextual"/>
         </w:rPr>
       </w:pPr>
-      <w:hyperlink w:anchor="_Toc244113378" w:history="1">
+      <w:hyperlink w:anchor="_Toc244113886" w:history="1">
         <w:r>
           <w:rPr>
             <w:rStyle w:val="Hyperlink"/>
@@ -3351,7 +3351,7 @@
             <w:noProof/>
             <w:webHidden/>
           </w:rPr>
-          <w:instrText xml:space="preserve"> PAGEREF _Toc244113378 \h </w:instrText>
+          <w:instrText xml:space="preserve"> PAGEREF _Toc244113886 \h </w:instrText>
         </w:r>
         <w:r>
           <w:rPr>
@@ -3398,7 +3398,7 @@
           <w14:ligatures w14:val="standardContextual"/>
         </w:rPr>
       </w:pPr>
-      <w:hyperlink w:anchor="_Toc244113379" w:history="1">
+      <w:hyperlink w:anchor="_Toc244113887" w:history="1">
         <w:r>
           <w:rPr>
             <w:rStyle w:val="Hyperlink"/>
@@ -3425,7 +3425,7 @@
             <w:noProof/>
             <w:webHidden/>
           </w:rPr>
-          <w:instrText xml:space="preserve"> PAGEREF _Toc244113379 \h </w:instrText>
+          <w:instrText xml:space="preserve"> PAGEREF _Toc244113887 \h </w:instrText>
         </w:r>
         <w:r>
           <w:rPr>
@@ -3472,7 +3472,7 @@
           <w14:ligatures w14:val="standardContextual"/>
         </w:rPr>
       </w:pPr>
-      <w:hyperlink w:anchor="_Toc244113380" w:history="1">
+      <w:hyperlink w:anchor="_Toc244113888" w:history="1">
         <w:r>
           <w:rPr>
             <w:rStyle w:val="Hyperlink"/>
@@ -3499,7 +3499,7 @@
             <w:noProof/>
             <w:webHidden/>
           </w:rPr>
-          <w:instrText xml:space="preserve"> PAGEREF _Toc244113380 \h </w:instrText>
+          <w:instrText xml:space="preserve"> PAGEREF _Toc244113888 \h </w:instrText>
         </w:r>
         <w:r>
           <w:rPr>
@@ -3546,7 +3546,7 @@
           <w14:ligatures w14:val="standardContextual"/>
         </w:rPr>
       </w:pPr>
-      <w:hyperlink w:anchor="_Toc244113381" w:history="1">
+      <w:hyperlink w:anchor="_Toc244113889" w:history="1">
         <w:r>
           <w:rPr>
             <w:rStyle w:val="Hyperlink"/>
@@ -3573,7 +3573,7 @@
             <w:noProof/>
             <w:webHidden/>
           </w:rPr>
-          <w:instrText xml:space="preserve"> PAGEREF _Toc244113381 \h </w:instrText>
+          <w:instrText xml:space="preserve"> PAGEREF _Toc244113889 \h </w:instrText>
         </w:r>
         <w:r>
           <w:rPr>
@@ -3620,7 +3620,7 @@
           <w14:ligatures w14:val="standardContextual"/>
         </w:rPr>
       </w:pPr>
-      <w:hyperlink w:anchor="_Toc244113382" w:history="1">
+      <w:hyperlink w:anchor="_Toc244113890" w:history="1">
         <w:r>
           <w:rPr>
             <w:rStyle w:val="Hyperlink"/>
@@ -3647,7 +3647,7 @@
             <w:noProof/>
             <w:webHidden/>
           </w:rPr>
-          <w:instrText xml:space="preserve"> PAGEREF _Toc244113382 \h </w:instrText>
+          <w:instrText xml:space="preserve"> PAGEREF _Toc244113890 \h </w:instrText>
         </w:r>
         <w:r>
           <w:rPr>
@@ -3694,7 +3694,7 @@
           <w14:ligatures w14:val="standardContextual"/>
         </w:rPr>
       </w:pPr>
-      <w:hyperlink w:anchor="_Toc244113383" w:history="1">
+      <w:hyperlink w:anchor="_Toc244113891" w:history="1">
         <w:r>
           <w:rPr>
             <w:rStyle w:val="Hyperlink"/>
@@ -3721,7 +3721,7 @@
             <w:noProof/>
             <w:webHidden/>
           </w:rPr>
-          <w:instrText xml:space="preserve"> PAGEREF _Toc244113383 \h </w:instrText>
+          <w:instrText xml:space="preserve"> PAGEREF _Toc244113891 \h </w:instrText>
         </w:r>
         <w:r>
           <w:rPr>
@@ -3768,7 +3768,7 @@
           <w14:ligatures w14:val="standardContextual"/>
         </w:rPr>
       </w:pPr>
-      <w:hyperlink w:anchor="_Toc244113384" w:history="1">
+      <w:hyperlink w:anchor="_Toc244113892" w:history="1">
         <w:r>
           <w:rPr>
             <w:rStyle w:val="Hyperlink"/>
@@ -3795,7 +3795,7 @@
             <w:noProof/>
             <w:webHidden/>
           </w:rPr>
-          <w:instrText xml:space="preserve"> PAGEREF _Toc244113384 \h </w:instrText>
+          <w:instrText xml:space="preserve"> PAGEREF _Toc244113892 \h </w:instrText>
         </w:r>
         <w:r>
           <w:rPr>
@@ -3842,7 +3842,7 @@
           <w14:ligatures w14:val="standardContextual"/>
         </w:rPr>
       </w:pPr>
-      <w:hyperlink w:anchor="_Toc244113385" w:history="1">
+      <w:hyperlink w:anchor="_Toc244113893" w:history="1">
         <w:r>
           <w:rPr>
             <w:rStyle w:val="Hyperlink"/>
@@ -3869,7 +3869,7 @@
             <w:noProof/>
             <w:webHidden/>
           </w:rPr>
-          <w:instrText xml:space="preserve"> PAGEREF _Toc244113385 \h </w:instrText>
+          <w:instrText xml:space="preserve"> PAGEREF _Toc244113893 \h </w:instrText>
         </w:r>
         <w:r>
           <w:rPr>
@@ -3916,7 +3916,7 @@
           <w14:ligatures w14:val="standardContextual"/>
         </w:rPr>
       </w:pPr>
-      <w:hyperlink w:anchor="_Toc244113386" w:history="1">
+      <w:hyperlink w:anchor="_Toc244113894" w:history="1">
         <w:r>
           <w:rPr>
             <w:rStyle w:val="Hyperlink"/>
@@ -3943,7 +3943,7 @@
             <w:noProof/>
             <w:webHidden/>
           </w:rPr>
-          <w:instrText xml:space="preserve"> PAGEREF _Toc244113386 \h </w:instrText>
+          <w:instrText xml:space="preserve"> PAGEREF _Toc244113894 \h </w:instrText>
         </w:r>
         <w:r>
           <w:rPr>
@@ -3990,7 +3990,7 @@
           <w14:ligatures w14:val="standardContextual"/>
         </w:rPr>
       </w:pPr>
-      <w:hyperlink w:anchor="_Toc244113387" w:history="1">
+      <w:hyperlink w:anchor="_Toc244113895" w:history="1">
         <w:r>
           <w:rPr>
             <w:rStyle w:val="Hyperlink"/>
@@ -4017,7 +4017,7 @@
             <w:noProof/>
             <w:webHidden/>
           </w:rPr>
-          <w:instrText xml:space="preserve"> PAGEREF _Toc244113387 \h </w:instrText>
+          <w:instrText xml:space="preserve"> PAGEREF _Toc244113895 \h </w:instrText>
         </w:r>
         <w:r>
           <w:rPr>
@@ -4064,7 +4064,7 @@
           <w14:ligatures w14:val="standardContextual"/>
         </w:rPr>
       </w:pPr>
-      <w:hyperlink w:anchor="_Toc244113388" w:history="1">
+      <w:hyperlink w:anchor="_Toc244113896" w:history="1">
         <w:r>
           <w:rPr>
             <w:rStyle w:val="Hyperlink"/>
@@ -4091,7 +4091,7 @@
             <w:noProof/>
             <w:webHidden/>
           </w:rPr>
-          <w:instrText xml:space="preserve"> PAGEREF _Toc244113388 \h </w:instrText>
+          <w:instrText xml:space="preserve"> PAGEREF _Toc244113896 \h </w:instrText>
         </w:r>
         <w:r>
           <w:rPr>
@@ -4138,7 +4138,7 @@
           <w14:ligatures w14:val="standardContextual"/>
         </w:rPr>
       </w:pPr>
-      <w:hyperlink w:anchor="_Toc244113389" w:history="1">
+      <w:hyperlink w:anchor="_Toc244113897" w:history="1">
         <w:r>
           <w:rPr>
             <w:rStyle w:val="Hyperlink"/>
@@ -4165,7 +4165,7 @@
             <w:noProof/>
             <w:webHidden/>
           </w:rPr>
-          <w:instrText xml:space="preserve"> PAGEREF _Toc244113389 \h </w:instrText>
+          <w:instrText xml:space="preserve"> PAGEREF _Toc244113897 \h </w:instrText>
         </w:r>
         <w:r>
           <w:rPr>
@@ -4212,7 +4212,7 @@
           <w14:ligatures w14:val="standardContextual"/>
         </w:rPr>
       </w:pPr>
-      <w:hyperlink w:anchor="_Toc244113390" w:history="1">
+      <w:hyperlink w:anchor="_Toc244113898" w:history="1">
         <w:r>
           <w:rPr>
             <w:rStyle w:val="Hyperlink"/>
@@ -4239,7 +4239,7 @@
             <w:noProof/>
             <w:webHidden/>
           </w:rPr>
-          <w:instrText xml:space="preserve"> PAGEREF _Toc244113390 \h </w:instrText>
+          <w:instrText xml:space="preserve"> PAGEREF _Toc244113898 \h </w:instrText>
         </w:r>
         <w:r>
           <w:rPr>
@@ -4286,7 +4286,7 @@
           <w14:ligatures w14:val="standardContextual"/>
         </w:rPr>
       </w:pPr>
-      <w:hyperlink w:anchor="_Toc244113391" w:history="1">
+      <w:hyperlink w:anchor="_Toc244113899" w:history="1">
         <w:r>
           <w:rPr>
             <w:rStyle w:val="Hyperlink"/>
@@ -4313,7 +4313,7 @@
             <w:noProof/>
             <w:webHidden/>
           </w:rPr>
-          <w:instrText xml:space="preserve"> PAGEREF _Toc244113391 \h </w:instrText>
+          <w:instrText xml:space="preserve"> PAGEREF _Toc244113899 \h </w:instrText>
         </w:r>
         <w:r>
           <w:rPr>
@@ -4360,7 +4360,7 @@
           <w14:ligatures w14:val="standardContextual"/>
         </w:rPr>
       </w:pPr>
-      <w:hyperlink w:anchor="_Toc244113392" w:history="1">
+      <w:hyperlink w:anchor="_Toc244113900" w:history="1">
         <w:r>
           <w:rPr>
             <w:rStyle w:val="Hyperlink"/>
@@ -4387,7 +4387,7 @@
             <w:noProof/>
             <w:webHidden/>
           </w:rPr>
-          <w:instrText xml:space="preserve"> PAGEREF _Toc244113392 \h </w:instrText>
+          <w:instrText xml:space="preserve"> PAGEREF _Toc244113900 \h </w:instrText>
         </w:r>
         <w:r>
           <w:rPr>
@@ -4434,7 +4434,7 @@
           <w14:ligatures w14:val="standardContextual"/>
         </w:rPr>
       </w:pPr>
-      <w:hyperlink w:anchor="_Toc244113393" w:history="1">
+      <w:hyperlink w:anchor="_Toc244113901" w:history="1">
         <w:r>
           <w:rPr>
             <w:rStyle w:val="Hyperlink"/>
@@ -4461,7 +4461,7 @@
             <w:noProof/>
             <w:webHidden/>
           </w:rPr>
-          <w:instrText xml:space="preserve"> PAGEREF _Toc244113393 \h </w:instrText>
+          <w:instrText xml:space="preserve"> PAGEREF _Toc244113901 \h </w:instrText>
         </w:r>
         <w:r>
           <w:rPr>
@@ -4508,7 +4508,7 @@
           <w14:ligatures w14:val="standardContextual"/>
         </w:rPr>
       </w:pPr>
-      <w:hyperlink w:anchor="_Toc244113394" w:history="1">
+      <w:hyperlink w:anchor="_Toc244113902" w:history="1">
         <w:r>
           <w:rPr>
             <w:rStyle w:val="Hyperlink"/>
@@ -4535,7 +4535,7 @@
             <w:noProof/>
             <w:webHidden/>
           </w:rPr>
-          <w:instrText xml:space="preserve"> PAGEREF _Toc244113394 \h </w:instrText>
+          <w:instrText xml:space="preserve"> PAGEREF _Toc244113902 \h </w:instrText>
         </w:r>
         <w:r>
           <w:rPr>
@@ -4582,7 +4582,7 @@
           <w14:ligatures w14:val="standardContextual"/>
         </w:rPr>
       </w:pPr>
-      <w:hyperlink w:anchor="_Toc244113395" w:history="1">
+      <w:hyperlink w:anchor="_Toc244113903" w:history="1">
         <w:r>
           <w:rPr>
             <w:rStyle w:val="Hyperlink"/>
@@ -4609,7 +4609,7 @@
             <w:noProof/>
             <w:webHidden/>
           </w:rPr>
-          <w:instrText xml:space="preserve"> PAGEREF _Toc244113395 \h </w:instrText>
+          <w:instrText xml:space="preserve"> PAGEREF _Toc244113903 \h </w:instrText>
         </w:r>
         <w:r>
           <w:rPr>
@@ -4656,7 +4656,7 @@
           <w14:ligatures w14:val="standardContextual"/>
         </w:rPr>
       </w:pPr>
-      <w:hyperlink w:anchor="_Toc244113396" w:history="1">
+      <w:hyperlink w:anchor="_Toc244113904" w:history="1">
         <w:r>
           <w:rPr>
             <w:rStyle w:val="Hyperlink"/>
@@ -4683,7 +4683,7 @@
             <w:noProof/>
             <w:webHidden/>
           </w:rPr>
-          <w:instrText xml:space="preserve"> PAGEREF _Toc244113396 \h </w:instrText>
+          <w:instrText xml:space="preserve"> PAGEREF _Toc244113904 \h </w:instrText>
         </w:r>
         <w:r>
           <w:rPr>
@@ -4730,7 +4730,7 @@
           <w14:ligatures w14:val="standardContextual"/>
         </w:rPr>
       </w:pPr>
-      <w:hyperlink w:anchor="_Toc244113397" w:history="1">
+      <w:hyperlink w:anchor="_Toc244113905" w:history="1">
         <w:r>
           <w:rPr>
             <w:rStyle w:val="Hyperlink"/>
@@ -4757,7 +4757,7 @@
             <w:noProof/>
             <w:webHidden/>
           </w:rPr>
-          <w:instrText xml:space="preserve"> PAGEREF _Toc244113397 \h </w:instrText>
+          <w:instrText xml:space="preserve"> PAGEREF _Toc244113905 \h </w:instrText>
         </w:r>
         <w:r>
           <w:rPr>
@@ -4804,7 +4804,7 @@
           <w14:ligatures w14:val="standardContextual"/>
         </w:rPr>
       </w:pPr>
-      <w:hyperlink w:anchor="_Toc244113398" w:history="1">
+      <w:hyperlink w:anchor="_Toc244113906" w:history="1">
         <w:r>
           <w:rPr>
             <w:rStyle w:val="Hyperlink"/>
@@ -4831,7 +4831,7 @@
             <w:noProof/>
             <w:webHidden/>
           </w:rPr>
-          <w:instrText xml:space="preserve"> PAGEREF _Toc244113398 \h </w:instrText>
+          <w:instrText xml:space="preserve"> PAGEREF _Toc244113906 \h </w:instrText>
         </w:r>
         <w:r>
           <w:rPr>
@@ -4878,7 +4878,7 @@
           <w14:ligatures w14:val="standardContextual"/>
         </w:rPr>
       </w:pPr>
-      <w:hyperlink w:anchor="_Toc244113399" w:history="1">
+      <w:hyperlink w:anchor="_Toc244113907" w:history="1">
         <w:r>
           <w:rPr>
             <w:rStyle w:val="Hyperlink"/>
@@ -4905,7 +4905,7 @@
             <w:noProof/>
             <w:webHidden/>
           </w:rPr>
-          <w:instrText xml:space="preserve"> PAGEREF _Toc244113399 \h </w:instrText>
+          <w:instrText xml:space="preserve"> PAGEREF _Toc244113907 \h </w:instrText>
         </w:r>
         <w:r>
           <w:rPr>
@@ -4952,7 +4952,7 @@
           <w14:ligatures w14:val="standardContextual"/>
         </w:rPr>
       </w:pPr>
-      <w:hyperlink w:anchor="_Toc244113400" w:history="1">
+      <w:hyperlink w:anchor="_Toc244113908" w:history="1">
         <w:r>
           <w:rPr>
             <w:rStyle w:val="Hyperlink"/>
@@ -4979,7 +4979,7 @@
             <w:noProof/>
             <w:webHidden/>
           </w:rPr>
-          <w:instrText xml:space="preserve"> PAGEREF _Toc244113400 \h </w:instrText>
+          <w:instrText xml:space="preserve"> PAGEREF _Toc244113908 \h </w:instrText>
         </w:r>
         <w:r>
           <w:rPr>
@@ -5026,7 +5026,7 @@
           <w14:ligatures w14:val="standardContextual"/>
         </w:rPr>
       </w:pPr>
-      <w:hyperlink w:anchor="_Toc244113401" w:history="1">
+      <w:hyperlink w:anchor="_Toc244113909" w:history="1">
         <w:r>
           <w:rPr>
             <w:rStyle w:val="Hyperlink"/>
@@ -5053,7 +5053,7 @@
             <w:noProof/>
             <w:webHidden/>
           </w:rPr>
-          <w:instrText xml:space="preserve"> PAGEREF _Toc244113401 \h </w:instrText>
+          <w:instrText xml:space="preserve"> PAGEREF _Toc244113909 \h </w:instrText>
         </w:r>
         <w:r>
           <w:rPr>
@@ -5100,7 +5100,7 @@
           <w14:ligatures w14:val="standardContextual"/>
         </w:rPr>
       </w:pPr>
-      <w:hyperlink w:anchor="_Toc244113402" w:history="1">
+      <w:hyperlink w:anchor="_Toc244113910" w:history="1">
         <w:r>
           <w:rPr>
             <w:rStyle w:val="Hyperlink"/>
@@ -5127,7 +5127,7 @@
             <w:noProof/>
             <w:webHidden/>
           </w:rPr>
-          <w:instrText xml:space="preserve"> PAGEREF _Toc244113402 \h </w:instrText>
+          <w:instrText xml:space="preserve"> PAGEREF _Toc244113910 \h </w:instrText>
         </w:r>
         <w:r>
           <w:rPr>
@@ -5174,7 +5174,7 @@
           <w14:ligatures w14:val="standardContextual"/>
         </w:rPr>
       </w:pPr>
-      <w:hyperlink w:anchor="_Toc244113403" w:history="1">
+      <w:hyperlink w:anchor="_Toc244113911" w:history="1">
         <w:r>
           <w:rPr>
             <w:rStyle w:val="Hyperlink"/>
@@ -5201,7 +5201,7 @@
             <w:noProof/>
             <w:webHidden/>
           </w:rPr>
-          <w:instrText xml:space="preserve"> PAGEREF _Toc244113403 \h </w:instrText>
+          <w:instrText xml:space="preserve"> PAGEREF _Toc244113911 \h </w:instrText>
         </w:r>
         <w:r>
           <w:rPr>
@@ -5221,7 +5221,7 @@
             <w:noProof/>
             <w:webHidden/>
           </w:rPr>
-          <w:t>37</w:t>
+          <w:t>38</w:t>
         </w:r>
         <w:r>
           <w:rPr>
@@ -5248,7 +5248,7 @@
           <w14:ligatures w14:val="standardContextual"/>
         </w:rPr>
       </w:pPr>
-      <w:hyperlink w:anchor="_Toc244113404" w:history="1">
+      <w:hyperlink w:anchor="_Toc244113912" w:history="1">
         <w:r>
           <w:rPr>
             <w:rStyle w:val="Hyperlink"/>
@@ -5275,7 +5275,7 @@
             <w:noProof/>
             <w:webHidden/>
           </w:rPr>
-          <w:instrText xml:space="preserve"> PAGEREF _Toc244113404 \h </w:instrText>
+          <w:instrText xml:space="preserve"> PAGEREF _Toc244113912 \h </w:instrText>
         </w:r>
         <w:r>
           <w:rPr>
@@ -5295,7 +5295,7 @@
             <w:noProof/>
             <w:webHidden/>
           </w:rPr>
-          <w:t>37</w:t>
+          <w:t>38</w:t>
         </w:r>
         <w:r>
           <w:rPr>
@@ -5322,7 +5322,7 @@
           <w14:ligatures w14:val="standardContextual"/>
         </w:rPr>
       </w:pPr>
-      <w:hyperlink w:anchor="_Toc244113405" w:history="1">
+      <w:hyperlink w:anchor="_Toc244113913" w:history="1">
         <w:r>
           <w:rPr>
             <w:rStyle w:val="Hyperlink"/>
@@ -5349,7 +5349,7 @@
             <w:noProof/>
             <w:webHidden/>
           </w:rPr>
-          <w:instrText xml:space="preserve"> PAGEREF _Toc244113405 \h </w:instrText>
+          <w:instrText xml:space="preserve"> PAGEREF _Toc244113913 \h </w:instrText>
         </w:r>
         <w:r>
           <w:rPr>
@@ -5369,7 +5369,7 @@
             <w:noProof/>
             <w:webHidden/>
           </w:rPr>
-          <w:t>37</w:t>
+          <w:t>38</w:t>
         </w:r>
         <w:r>
           <w:rPr>
@@ -5389,7 +5389,7 @@
       <w:pPr>
         <w:pStyle w:val="Heading1"/>
       </w:pPr>
-      <w:bookmarkStart w:id="3" w:name="_Toc244113357"/>
+      <w:bookmarkStart w:id="3" w:name="_Toc244113865"/>
       <w:r>
         <w:t>Danh m</w:t>
       </w:r>
@@ -5553,7 +5553,7 @@
         <w:rPr>
           <w:noProof/>
         </w:rPr>
-        <w:t>14</w:t>
+        <w:t>15</w:t>
       </w:r>
       <w:r>
         <w:fldChar w:fldCharType="end"/>
@@ -6161,7 +6161,7 @@
       <w:pPr>
         <w:pStyle w:val="Heading1"/>
       </w:pPr>
-      <w:bookmarkStart w:id="4" w:name="_Toc244113358"/>
+      <w:bookmarkStart w:id="4" w:name="_Toc244113866"/>
       <w:r>
         <w:t>Danh m</w:t>
       </w:r>
@@ -6479,7 +6479,7 @@
         <w:rPr>
           <w:noProof/>
         </w:rPr>
-        <w:t>15</w:t>
+        <w:t>16</w:t>
       </w:r>
       <w:r>
         <w:fldChar w:fldCharType="end"/>
@@ -6532,7 +6532,7 @@
         <w:rPr>
           <w:noProof/>
         </w:rPr>
-        <w:t>16</w:t>
+        <w:t>17</w:t>
       </w:r>
       <w:r>
         <w:fldChar w:fldCharType="end"/>
@@ -6591,7 +6591,7 @@
         <w:rPr>
           <w:noProof/>
         </w:rPr>
-        <w:t>19</w:t>
+        <w:t>20</w:t>
       </w:r>
       <w:r>
         <w:fldChar w:fldCharType="end"/>
@@ -6911,6 +6911,59 @@
           <w:noProof/>
         </w:rPr>
         <w:t>34</w:t>
+      </w:r>
+      <w:r>
+        <w:fldChar w:fldCharType="end"/>
+      </w:r>
+    </w:p>
+    <w:p>
+      <w:r>
+        <w:t>B</w:t>
+      </w:r>
+      <w:r>
+        <w:t>ả</w:t>
+      </w:r>
+      <w:r>
+        <w:t>ng 14. Các nhóm b</w:t>
+      </w:r>
+      <w:r>
+        <w:t>ả</w:t>
+      </w:r>
+      <w:r>
+        <w:t>ng Core có trong Flyway t</w:t>
+      </w:r>
+      <w:r>
+        <w:t>ạ</w:t>
+      </w:r>
+      <w:r>
+        <w:t>i m</w:t>
+      </w:r>
+      <w:r>
+        <w:t>ố</w:t>
+      </w:r>
+      <w:r>
+        <w:t>c kh</w:t>
+      </w:r>
+      <w:r>
+        <w:t>ả</w:t>
+      </w:r>
+      <w:r>
+        <w:t xml:space="preserve">o sát.  </w:t>
+      </w:r>
+      <w:r>
+        <w:fldChar w:fldCharType="begin"/>
+      </w:r>
+      <w:r>
+        <w:instrText xml:space="preserve"> PAGEREF tab-14 \h </w:instrText>
+      </w:r>
+      <w:r>
+        <w:fldChar w:fldCharType="separate"/>
+      </w:r>
+      <w:r>
+        <w:rPr>
+          <w:noProof/>
+        </w:rPr>
+        <w:t>37</w:t>
       </w:r>
       <w:r>
         <w:fldChar w:fldCharType="end"/>
@@ -6920,7 +6973,7 @@
       <w:pPr>
         <w:pStyle w:val="Heading1"/>
       </w:pPr>
-      <w:bookmarkStart w:id="5" w:name="_Toc244113359"/>
+      <w:bookmarkStart w:id="5" w:name="_Toc244113867"/>
       <w:r>
         <w:lastRenderedPageBreak/>
         <w:t>T</w:t>
@@ -8041,7 +8094,7 @@
       <w:pPr>
         <w:pStyle w:val="Heading1"/>
       </w:pPr>
-      <w:bookmarkStart w:id="7" w:name="_Toc244113360"/>
+      <w:bookmarkStart w:id="7" w:name="_Toc244113868"/>
       <w:r>
         <w:t>Chương 1. T</w:t>
       </w:r>
@@ -8063,7 +8116,7 @@
       <w:pPr>
         <w:pStyle w:val="Heading2"/>
       </w:pPr>
-      <w:bookmarkStart w:id="8" w:name="_Toc244113361"/>
+      <w:bookmarkStart w:id="8" w:name="_Toc244113869"/>
       <w:r>
         <w:t>1.1. B</w:t>
       </w:r>
@@ -8702,7 +8755,7 @@
       <w:pPr>
         <w:pStyle w:val="Heading2"/>
       </w:pPr>
-      <w:bookmarkStart w:id="9" w:name="_Toc244113362"/>
+      <w:bookmarkStart w:id="9" w:name="_Toc244113870"/>
       <w:r>
         <w:t>1.2. M</w:t>
       </w:r>
@@ -10021,7 +10074,7 @@
         </w:rPr>
         <w:lastRenderedPageBreak/>
         <w:drawing>
-          <wp:inline distT="0" distB="0" distL="0" distR="0" wp14:anchorId="5DCF858E" wp14:editId="7D438E38">
+          <wp:inline distT="0" distB="0" distL="0" distR="0" wp14:anchorId="4213CBC7" wp14:editId="0C7D70C1">
             <wp:extent cx="5832000" cy="3280500"/>
             <wp:effectExtent l="0" t="0" r="0" b="0"/>
             <wp:docPr id="1" name="Picture 1"/>
@@ -10096,7 +10149,7 @@
       <w:pPr>
         <w:pStyle w:val="Heading2"/>
       </w:pPr>
-      <w:bookmarkStart w:id="12" w:name="_Toc244113363"/>
+      <w:bookmarkStart w:id="12" w:name="_Toc244113871"/>
       <w:r>
         <w:t>1.3. Phân công và ngu</w:t>
       </w:r>
@@ -10337,7 +10390,7 @@
       <w:pPr>
         <w:pStyle w:val="Heading1"/>
       </w:pPr>
-      <w:bookmarkStart w:id="13" w:name="_Toc244113364"/>
+      <w:bookmarkStart w:id="13" w:name="_Toc244113872"/>
       <w:r>
         <w:t>Chương 2. Phân tích yêu c</w:t>
       </w:r>
@@ -10353,7 +10406,7 @@
       <w:pPr>
         <w:pStyle w:val="Heading2"/>
       </w:pPr>
-      <w:bookmarkStart w:id="14" w:name="_Toc244113365"/>
+      <w:bookmarkStart w:id="14" w:name="_Toc244113873"/>
       <w:r>
         <w:t>2.1. Tác nhân, use case và quy</w:t>
       </w:r>
@@ -10602,7 +10655,7 @@
         </w:rPr>
         <w:lastRenderedPageBreak/>
         <w:drawing>
-          <wp:inline distT="0" distB="0" distL="0" distR="0" wp14:anchorId="23B4014B" wp14:editId="4BA252F7">
+          <wp:inline distT="0" distB="0" distL="0" distR="0" wp14:anchorId="435B5F53" wp14:editId="2364CA5F">
             <wp:extent cx="5832000" cy="3280500"/>
             <wp:effectExtent l="0" t="0" r="0" b="0"/>
             <wp:docPr id="2" name="Picture 2"/>
@@ -10659,7 +10712,7 @@
       <w:pPr>
         <w:pStyle w:val="Heading2"/>
       </w:pPr>
-      <w:bookmarkStart w:id="16" w:name="_Toc244113366"/>
+      <w:bookmarkStart w:id="16" w:name="_Toc244113874"/>
       <w:r>
         <w:t>2.2. Câu chuy</w:t>
       </w:r>
@@ -17153,7 +17206,7 @@
       <w:pPr>
         <w:pStyle w:val="Heading2"/>
       </w:pPr>
-      <w:bookmarkStart w:id="19" w:name="_Toc244113367"/>
+      <w:bookmarkStart w:id="19" w:name="_Toc244113875"/>
       <w:r>
         <w:t>2.3. Yêu c</w:t>
       </w:r>
@@ -18623,7 +18676,7 @@
       <w:pPr>
         <w:pStyle w:val="Heading1"/>
       </w:pPr>
-      <w:bookmarkStart w:id="21" w:name="_Toc244113368"/>
+      <w:bookmarkStart w:id="21" w:name="_Toc244113876"/>
       <w:r>
         <w:lastRenderedPageBreak/>
         <w:t>Chương 3. Phân tích đ</w:t>
@@ -18658,7 +18711,7 @@
       <w:pPr>
         <w:pStyle w:val="Heading2"/>
       </w:pPr>
-      <w:bookmarkStart w:id="22" w:name="_Toc244113369"/>
+      <w:bookmarkStart w:id="22" w:name="_Toc244113877"/>
       <w:r>
         <w:t>3.1. Th</w:t>
       </w:r>
@@ -19294,7 +19347,7 @@
       <w:pPr>
         <w:pStyle w:val="Heading2"/>
       </w:pPr>
-      <w:bookmarkStart w:id="23" w:name="_Toc244113370"/>
+      <w:bookmarkStart w:id="23" w:name="_Toc244113878"/>
       <w:r>
         <w:t>3.2. C</w:t>
       </w:r>
@@ -19325,43 +19378,149 @@
         <w:t>ả</w:t>
       </w:r>
       <w:r>
-        <w:t xml:space="preserve"> record mi</w:t>
+        <w:t xml:space="preserve"> 12 ki</w:t>
+      </w:r>
+      <w:r>
+        <w:t>ể</w:t>
+      </w:r>
+      <w:r>
+        <w:t>u mi</w:t>
       </w:r>
       <w:r>
         <w:t>ề</w:t>
       </w:r>
       <w:r>
-        <w:t>n và l</w:t>
-      </w:r>
-      <w:r>
-        <w:t>ớ</w:t>
-      </w:r>
-      <w:r>
-        <w:t>p đi</w:t>
-      </w:r>
-      <w:r>
-        <w:t>ề</w:t>
-      </w:r>
-      <w:r>
-        <w:t>u ph</w:t>
+        <w:t>n có th</w:t>
+      </w:r>
+      <w:r>
+        <w:t>ậ</w:t>
+      </w:r>
+      <w:r>
+        <w:t>t: danh tính, Catalog, Loan, Hold, đ</w:t>
+      </w:r>
+      <w:r>
+        <w:t>ị</w:t>
+      </w:r>
+      <w:r>
+        <w:t>a đi</w:t>
+      </w:r>
+      <w:r>
+        <w:t>ể</w:t>
+      </w:r>
+      <w:r>
+        <w:t>m và b</w:t>
+      </w:r>
+      <w:r>
+        <w:t>ằ</w:t>
+      </w:r>
+      <w:r>
+        <w:t>ng ch</w:t>
+      </w:r>
+      <w:r>
+        <w:t>ứ</w:t>
+      </w:r>
+      <w:r>
+        <w:t>ng ki</w:t>
+      </w:r>
+      <w:r>
+        <w:t>ể</w:t>
+      </w:r>
+      <w:r>
+        <w:t>m kê. Các đư</w:t>
+      </w:r>
+      <w:r>
+        <w:t>ờ</w:t>
+      </w:r>
+      <w:r>
+        <w:t>ng n</w:t>
       </w:r>
       <w:r>
         <w:t>ố</w:t>
       </w:r>
       <w:r>
-        <w:t>i có th</w:t>
-      </w:r>
-      <w:r>
-        <w:t>ậ</w:t>
-      </w:r>
-      <w:r>
-        <w:t>t, g</w:t>
-      </w:r>
-      <w:r>
-        <w:t>ồ</w:t>
-      </w:r>
-      <w:r>
-        <w:t xml:space="preserve">m </w:t>
+        <w:t>i ch</w:t>
+      </w:r>
+      <w:r>
+        <w:t>ỉ</w:t>
+      </w:r>
+      <w:r>
+        <w:t xml:space="preserve"> các quan h</w:t>
+      </w:r>
+      <w:r>
+        <w:t>ệ</w:t>
+      </w:r>
+      <w:r>
+        <w:t xml:space="preserve"> chính; thu</w:t>
+      </w:r>
+      <w:r>
+        <w:t>ộ</w:t>
+      </w:r>
+      <w:r>
+        <w:t xml:space="preserve">c tính </w:t>
+      </w:r>
+      <w:r>
+        <w:rPr>
+          <w:rFonts w:ascii="Consolas" w:hAnsi="Consolas"/>
+          <w:sz w:val="20"/>
+        </w:rPr>
+        <w:t>readerId</w:t>
+      </w:r>
+      <w:r>
+        <w:t xml:space="preserve">, </w:t>
+      </w:r>
+      <w:r>
+        <w:rPr>
+          <w:rFonts w:ascii="Consolas" w:hAnsi="Consolas"/>
+          <w:sz w:val="20"/>
+        </w:rPr>
+        <w:t>bookId</w:t>
+      </w:r>
+      <w:r>
+        <w:t xml:space="preserve">, </w:t>
+      </w:r>
+      <w:r>
+        <w:rPr>
+          <w:rFonts w:ascii="Consolas" w:hAnsi="Consolas"/>
+          <w:sz w:val="20"/>
+        </w:rPr>
+        <w:t>editionId</w:t>
+      </w:r>
+      <w:r>
+        <w:t xml:space="preserve"> và </w:t>
+      </w:r>
+      <w:r>
+        <w:rPr>
+          <w:rFonts w:ascii="Consolas" w:hAnsi="Consolas"/>
+          <w:sz w:val="20"/>
+        </w:rPr>
+        <w:t>branchId</w:t>
+      </w:r>
+      <w:r>
+        <w:t xml:space="preserve"> cho bi</w:t>
+      </w:r>
+      <w:r>
+        <w:t>ế</w:t>
+      </w:r>
+      <w:r>
+        <w:t>t nh</w:t>
+      </w:r>
+      <w:r>
+        <w:t>ữ</w:t>
+      </w:r>
+      <w:r>
+        <w:t>ng tham chi</w:t>
+      </w:r>
+      <w:r>
+        <w:t>ế</w:t>
+      </w:r>
+      <w:r>
+        <w:t>u còn l</w:t>
+      </w:r>
+      <w:r>
+        <w:t>ạ</w:t>
+      </w:r>
+      <w:r>
+        <w:t xml:space="preserve">i. </w:t>
       </w:r>
       <w:r>
         <w:rPr>
@@ -19391,7 +19550,43 @@
         <w:t>InventorySessionService.start/scan/close</w:t>
       </w:r>
       <w:r>
-        <w:t xml:space="preserve">. Core dùng </w:t>
+        <w:t xml:space="preserve"> là l</w:t>
+      </w:r>
+      <w:r>
+        <w:t>ớ</w:t>
+      </w:r>
+      <w:r>
+        <w:t>p x</w:t>
+      </w:r>
+      <w:r>
+        <w:t>ử</w:t>
+      </w:r>
+      <w:r>
+        <w:t xml:space="preserve"> lý bên ngoài hình này, không ph</w:t>
+      </w:r>
+      <w:r>
+        <w:t>ả</w:t>
+      </w:r>
+      <w:r>
+        <w:t>i b</w:t>
+      </w:r>
+      <w:r>
+        <w:t>ả</w:t>
+      </w:r>
+      <w:r>
+        <w:t>ng d</w:t>
+      </w:r>
+      <w:r>
+        <w:t>ữ</w:t>
+      </w:r>
+      <w:r>
+        <w:t xml:space="preserve"> li</w:t>
+      </w:r>
+      <w:r>
+        <w:t>ệ</w:t>
+      </w:r>
+      <w:r>
+        <w:t xml:space="preserve">u. Core dùng </w:t>
       </w:r>
       <w:r>
         <w:rPr>
@@ -19407,72 +19602,18 @@
         <w:t>ạ</w:t>
       </w:r>
       <w:r>
-        <w:t xml:space="preserve"> dòng vào record/DTO; repository này không ph</w:t>
-      </w:r>
-      <w:r>
-        <w:t>ả</w:t>
-      </w:r>
-      <w:r>
-        <w:t>i JPA entity. Insight dùng Prisma model và Client. Sơ đ</w:t>
-      </w:r>
-      <w:r>
-        <w:t>ồ</w:t>
-      </w:r>
-      <w:r>
-        <w:t xml:space="preserve"> không gán phương th</w:t>
-      </w:r>
-      <w:r>
-        <w:t>ứ</w:t>
-      </w:r>
-      <w:r>
-        <w:t>c service vào b</w:t>
-      </w:r>
-      <w:r>
-        <w:t>ả</w:t>
-      </w:r>
-      <w:r>
-        <w:t>ng d</w:t>
+        <w:t xml:space="preserve"> dòng vào record/DTO, không dùng JPA entity; Insight dùng Prisma model và Client. DTO ki</w:t>
+      </w:r>
+      <w:r>
+        <w:t>ể</w:t>
+      </w:r>
+      <w:r>
+        <w:t>m biên HTTP, service gi</w:t>
       </w:r>
       <w:r>
         <w:t>ữ</w:t>
       </w:r>
       <w:r>
-        <w:t xml:space="preserve"> li</w:t>
-      </w:r>
-      <w:r>
-        <w:t>ệ</w:t>
-      </w:r>
-      <w:r>
-        <w:t>u. Phân bi</w:t>
-      </w:r>
-      <w:r>
-        <w:t>ệ</w:t>
-      </w:r>
-      <w:r>
-        <w:t>t này giúp nhìn ra đi</w:t>
-      </w:r>
-      <w:r>
-        <w:t>ể</w:t>
-      </w:r>
-      <w:r>
-        <w:t>m ch</w:t>
-      </w:r>
-      <w:r>
-        <w:t>ị</w:t>
-      </w:r>
-      <w:r>
-        <w:t>u trách nhi</w:t>
-      </w:r>
-      <w:r>
-        <w:t>ệ</w:t>
-      </w:r>
-      <w:r>
-        <w:t>m gi</w:t>
-      </w:r>
-      <w:r>
-        <w:t>ữ</w:t>
-      </w:r>
-      <w:r>
         <w:t xml:space="preserve"> b</w:t>
       </w:r>
       <w:r>
@@ -19485,37 +19626,7 @@
         <w:t>ế</w:t>
       </w:r>
       <w:r>
-        <w:t>n: DTO ki</w:t>
-      </w:r>
-      <w:r>
-        <w:t>ể</w:t>
-      </w:r>
-      <w:r>
-        <w:t>m biên HTTP, service quy</w:t>
-      </w:r>
-      <w:r>
-        <w:t>ế</w:t>
-      </w:r>
-      <w:r>
-        <w:t>t đ</w:t>
-      </w:r>
-      <w:r>
-        <w:t>ị</w:t>
-      </w:r>
-      <w:r>
-        <w:t>nh nghi</w:t>
-      </w:r>
-      <w:r>
-        <w:t>ệ</w:t>
-      </w:r>
-      <w:r>
-        <w:t>p v</w:t>
-      </w:r>
-      <w:r>
-        <w:t>ụ</w:t>
-      </w:r>
-      <w:r>
-        <w:t>, repository th</w:t>
+        <w:t>n, repository th</w:t>
       </w:r>
       <w:r>
         <w:t>ự</w:t>
@@ -19541,7 +19652,7 @@
         </w:rPr>
         <w:lastRenderedPageBreak/>
         <w:drawing>
-          <wp:inline distT="0" distB="0" distL="0" distR="0" wp14:anchorId="2D55BAD4" wp14:editId="4CED1C79">
+          <wp:inline distT="0" distB="0" distL="0" distR="0" wp14:anchorId="6CB46278" wp14:editId="5F328C21">
             <wp:extent cx="5832000" cy="3280500"/>
             <wp:effectExtent l="0" t="0" r="0" b="0"/>
             <wp:docPr id="3" name="Picture 3"/>
@@ -19616,7 +19727,7 @@
       <w:pPr>
         <w:pStyle w:val="Heading2"/>
       </w:pPr>
-      <w:bookmarkStart w:id="25" w:name="_Toc244113371"/>
+      <w:bookmarkStart w:id="25" w:name="_Toc244113879"/>
       <w:r>
         <w:t>3.3. ERD và vòng đ</w:t>
       </w:r>
@@ -19714,25 +19825,67 @@
         <w:t>ẽ</w:t>
       </w:r>
       <w:r>
-        <w:t xml:space="preserve"> các quan h</w:t>
-      </w:r>
-      <w:r>
-        <w:t>ệ</w:t>
-      </w:r>
-      <w:r>
-        <w:t xml:space="preserve"> c</w:t>
-      </w:r>
-      <w:r>
-        <w:t>ố</w:t>
-      </w:r>
-      <w:r>
-        <w:t>t lõi t</w:t>
+        <w:t xml:space="preserve"> 16 b</w:t>
+      </w:r>
+      <w:r>
+        <w:t>ả</w:t>
+      </w:r>
+      <w:r>
+        <w:t>ng Core tiêu bi</w:t>
+      </w:r>
+      <w:r>
+        <w:t>ể</w:t>
+      </w:r>
+      <w:r>
+        <w:t>u t</w:t>
       </w:r>
       <w:r>
         <w:t>ừ</w:t>
       </w:r>
       <w:r>
-        <w:t xml:space="preserve"> migration, không đưa b</w:t>
+        <w:t xml:space="preserve"> migration; nó không thay th</w:t>
+      </w:r>
+      <w:r>
+        <w:t>ế</w:t>
+      </w:r>
+      <w:r>
+        <w:t xml:space="preserve"> danh sách b</w:t>
+      </w:r>
+      <w:r>
+        <w:t>ả</w:t>
+      </w:r>
+      <w:r>
+        <w:t>ng và constraint đ</w:t>
+      </w:r>
+      <w:r>
+        <w:t>ầ</w:t>
+      </w:r>
+      <w:r>
+        <w:t>y đ</w:t>
+      </w:r>
+      <w:r>
+        <w:t>ủ</w:t>
+      </w:r>
+      <w:r>
+        <w:t xml:space="preserve"> </w:t>
+      </w:r>
+      <w:r>
+        <w:t>ở</w:t>
+      </w:r>
+      <w:r>
+        <w:t xml:space="preserve"> ph</w:t>
+      </w:r>
+      <w:r>
+        <w:t>ụ</w:t>
+      </w:r>
+      <w:r>
+        <w:t xml:space="preserve"> l</w:t>
+      </w:r>
+      <w:r>
+        <w:t>ụ</w:t>
+      </w:r>
+      <w:r>
+        <w:t>c/data dictionary. Các b</w:t>
       </w:r>
       <w:r>
         <w:t>ả</w:t>
@@ -19780,7 +19933,7 @@
         <w:t>system_policies</w:t>
       </w:r>
       <w:r>
-        <w:t xml:space="preserve"> vào ERD th</w:t>
+        <w:t xml:space="preserve"> không có trong ERD th</w:t>
       </w:r>
       <w:r>
         <w:t>ự</w:t>
@@ -19818,8 +19971,9 @@
         <w:rPr>
           <w:noProof/>
         </w:rPr>
+        <w:lastRenderedPageBreak/>
         <w:drawing>
-          <wp:inline distT="0" distB="0" distL="0" distR="0" wp14:anchorId="3F6A3668" wp14:editId="68B6158F">
+          <wp:inline distT="0" distB="0" distL="0" distR="0" wp14:anchorId="3136B59E" wp14:editId="1AE229E5">
             <wp:extent cx="5832000" cy="3280500"/>
             <wp:effectExtent l="0" t="0" r="0" b="0"/>
             <wp:docPr id="4" name="Picture 4"/>
@@ -19887,9 +20041,8 @@
         <w:rPr>
           <w:noProof/>
         </w:rPr>
-        <w:lastRenderedPageBreak/>
         <w:drawing>
-          <wp:inline distT="0" distB="0" distL="0" distR="0" wp14:anchorId="2C6610BA" wp14:editId="629C7A1F">
+          <wp:inline distT="0" distB="0" distL="0" distR="0" wp14:anchorId="716DF235" wp14:editId="21F1C80D">
             <wp:extent cx="5832000" cy="3280500"/>
             <wp:effectExtent l="0" t="0" r="0" b="0"/>
             <wp:docPr id="5" name="Picture 5"/>
@@ -20180,6 +20333,7 @@
       </w:pPr>
       <w:bookmarkStart w:id="28" w:name="tab-6"/>
       <w:r>
+        <w:lastRenderedPageBreak/>
         <w:t>B</w:t>
       </w:r>
       <w:r>
@@ -21232,7 +21386,6 @@
               <w:rPr>
                 <w:sz w:val="21"/>
               </w:rPr>
-              <w:lastRenderedPageBreak/>
               <w:t>Core UUID ↔ Insight owner/book</w:t>
             </w:r>
           </w:p>
@@ -21330,7 +21483,7 @@
       <w:pPr>
         <w:pStyle w:val="Heading2"/>
       </w:pPr>
-      <w:bookmarkStart w:id="29" w:name="_Toc244113372"/>
+      <w:bookmarkStart w:id="29" w:name="_Toc244113880"/>
       <w:r>
         <w:t>3.4. T</w:t>
       </w:r>
@@ -21917,6 +22070,7 @@
       </w:pPr>
       <w:bookmarkStart w:id="30" w:name="tab-7"/>
       <w:r>
+        <w:lastRenderedPageBreak/>
         <w:t>B</w:t>
       </w:r>
       <w:r>
@@ -22522,9 +22676,8 @@
       <w:pPr>
         <w:pStyle w:val="Heading1"/>
       </w:pPr>
-      <w:bookmarkStart w:id="31" w:name="_Toc244113373"/>
-      <w:r>
-        <w:lastRenderedPageBreak/>
+      <w:bookmarkStart w:id="31" w:name="_Toc244113881"/>
+      <w:r>
         <w:t>Chương 4. Ki</w:t>
       </w:r>
       <w:r>
@@ -22545,7 +22698,7 @@
       <w:pPr>
         <w:pStyle w:val="Heading2"/>
       </w:pPr>
-      <w:bookmarkStart w:id="32" w:name="_Toc244113374"/>
+      <w:bookmarkStart w:id="32" w:name="_Toc244113882"/>
       <w:r>
         <w:t>4.1. Thành ph</w:t>
       </w:r>
@@ -22796,7 +22949,7 @@
           <w:noProof/>
         </w:rPr>
         <w:drawing>
-          <wp:inline distT="0" distB="0" distL="0" distR="0" wp14:anchorId="2805ED33" wp14:editId="066993A0">
+          <wp:inline distT="0" distB="0" distL="0" distR="0" wp14:anchorId="53946AAC" wp14:editId="7FCD1B0D">
             <wp:extent cx="5832000" cy="3280500"/>
             <wp:effectExtent l="0" t="0" r="0" b="0"/>
             <wp:docPr id="6" name="Picture 6"/>
@@ -22881,6 +23034,7 @@
     </w:p>
     <w:p>
       <w:r>
+        <w:lastRenderedPageBreak/>
         <w:t>Ki</w:t>
       </w:r>
       <w:r>
@@ -23110,7 +23264,7 @@
       <w:pPr>
         <w:pStyle w:val="Heading2"/>
       </w:pPr>
-      <w:bookmarkStart w:id="34" w:name="_Toc244113375"/>
+      <w:bookmarkStart w:id="34" w:name="_Toc244113883"/>
       <w:r>
         <w:t>4.2. Sequence gi</w:t>
       </w:r>
@@ -23312,11 +23466,7 @@
         <w:t>ớ</w:t>
       </w:r>
       <w:r>
-        <w:t xml:space="preserve">c trong cùng </w:t>
-      </w:r>
-      <w:r>
-        <w:lastRenderedPageBreak/>
-        <w:t xml:space="preserve">Book. </w:t>
+        <w:t xml:space="preserve">c trong cùng Book. </w:t>
       </w:r>
       <w:hyperlink w:anchor="fig-7">
         <w:r>
@@ -23397,7 +23547,7 @@
           <w:noProof/>
         </w:rPr>
         <w:drawing>
-          <wp:inline distT="0" distB="0" distL="0" distR="0" wp14:anchorId="1B51094A" wp14:editId="0EDE1D26">
+          <wp:inline distT="0" distB="0" distL="0" distR="0" wp14:anchorId="7A93C85E" wp14:editId="127AA7BA">
             <wp:extent cx="5832000" cy="3280500"/>
             <wp:effectExtent l="0" t="0" r="0" b="0"/>
             <wp:docPr id="7" name="Picture 7"/>
@@ -23684,8 +23834,9 @@
       <w:pPr>
         <w:pStyle w:val="Heading2"/>
       </w:pPr>
-      <w:bookmarkStart w:id="36" w:name="_Toc244113376"/>
-      <w:r>
+      <w:bookmarkStart w:id="36" w:name="_Toc244113884"/>
+      <w:r>
+        <w:lastRenderedPageBreak/>
         <w:t>4.3. Tri</w:t>
       </w:r>
       <w:r>
@@ -23892,9 +24043,8 @@
         <w:rPr>
           <w:noProof/>
         </w:rPr>
-        <w:lastRenderedPageBreak/>
         <w:drawing>
-          <wp:inline distT="0" distB="0" distL="0" distR="0" wp14:anchorId="7A10F64B" wp14:editId="77C5A3FD">
+          <wp:inline distT="0" distB="0" distL="0" distR="0" wp14:anchorId="06813B81" wp14:editId="26D4686E">
             <wp:extent cx="5832000" cy="3280500"/>
             <wp:effectExtent l="0" t="0" r="0" b="0"/>
             <wp:docPr id="8" name="Picture 8"/>
@@ -23957,7 +24107,7 @@
       <w:pPr>
         <w:pStyle w:val="Heading2"/>
       </w:pPr>
-      <w:bookmarkStart w:id="38" w:name="_Toc244113377"/>
+      <w:bookmarkStart w:id="38" w:name="_Toc244113885"/>
       <w:r>
         <w:t>4.4. H</w:t>
       </w:r>
@@ -24437,6 +24587,7 @@
       </w:pPr>
       <w:bookmarkStart w:id="39" w:name="tab-8"/>
       <w:r>
+        <w:lastRenderedPageBreak/>
         <w:t>B</w:t>
       </w:r>
       <w:r>
@@ -24931,7 +25082,6 @@
               <w:rPr>
                 <w:sz w:val="21"/>
               </w:rPr>
-              <w:lastRenderedPageBreak/>
               <w:t>Reader g</w:t>
             </w:r>
             <w:r>
@@ -25485,7 +25635,7 @@
       <w:pPr>
         <w:pStyle w:val="Heading1"/>
       </w:pPr>
-      <w:bookmarkStart w:id="40" w:name="_Toc244113378"/>
+      <w:bookmarkStart w:id="40" w:name="_Toc244113886"/>
       <w:r>
         <w:t>Chương 5. Thi</w:t>
       </w:r>
@@ -25519,7 +25669,7 @@
       <w:pPr>
         <w:pStyle w:val="Heading2"/>
       </w:pPr>
-      <w:bookmarkStart w:id="41" w:name="_Toc244113379"/>
+      <w:bookmarkStart w:id="41" w:name="_Toc244113887"/>
       <w:r>
         <w:t>5.1. Design system và b</w:t>
       </w:r>
@@ -26122,7 +26272,7 @@
         </w:rPr>
         <w:lastRenderedPageBreak/>
         <w:drawing>
-          <wp:inline distT="0" distB="0" distL="0" distR="0" wp14:anchorId="74310DC7" wp14:editId="18EA88A7">
+          <wp:inline distT="0" distB="0" distL="0" distR="0" wp14:anchorId="3DB71003" wp14:editId="32EE2AF1">
             <wp:extent cx="5534519" cy="4320000"/>
             <wp:effectExtent l="0" t="0" r="0" b="0"/>
             <wp:docPr id="9" name="Picture 9"/>
@@ -26191,7 +26341,7 @@
       <w:pPr>
         <w:pStyle w:val="Heading2"/>
       </w:pPr>
-      <w:bookmarkStart w:id="43" w:name="_Toc244113380"/>
+      <w:bookmarkStart w:id="43" w:name="_Toc244113888"/>
       <w:r>
         <w:t>5.2. Hành trình theo vai trò và wireframe</w:t>
       </w:r>
@@ -26433,7 +26583,7 @@
         </w:rPr>
         <w:lastRenderedPageBreak/>
         <w:drawing>
-          <wp:inline distT="0" distB="0" distL="0" distR="0" wp14:anchorId="78891DCB" wp14:editId="3F48FE9D">
+          <wp:inline distT="0" distB="0" distL="0" distR="0" wp14:anchorId="75F22FF2" wp14:editId="6726534B">
             <wp:extent cx="5832000" cy="3280500"/>
             <wp:effectExtent l="0" t="0" r="0" b="0"/>
             <wp:docPr id="10" name="Picture 10"/>
@@ -26502,7 +26652,7 @@
           <w:noProof/>
         </w:rPr>
         <w:drawing>
-          <wp:inline distT="0" distB="0" distL="0" distR="0" wp14:anchorId="6E5CAF43" wp14:editId="74BCA28F">
+          <wp:inline distT="0" distB="0" distL="0" distR="0" wp14:anchorId="4456522A" wp14:editId="3E9B0101">
             <wp:extent cx="5554285" cy="4319999"/>
             <wp:effectExtent l="0" t="0" r="0" b="0"/>
             <wp:docPr id="11" name="Picture 11"/>
@@ -26578,7 +26728,7 @@
         </w:rPr>
         <w:lastRenderedPageBreak/>
         <w:drawing>
-          <wp:inline distT="0" distB="0" distL="0" distR="0" wp14:anchorId="03B546A8" wp14:editId="5C645480">
+          <wp:inline distT="0" distB="0" distL="0" distR="0" wp14:anchorId="5B8264D8" wp14:editId="3463985F">
             <wp:extent cx="5184000" cy="4320000"/>
             <wp:effectExtent l="0" t="0" r="0" b="0"/>
             <wp:docPr id="12" name="Picture 12"/>
@@ -26871,7 +27021,7 @@
         </w:rPr>
         <w:lastRenderedPageBreak/>
         <w:drawing>
-          <wp:inline distT="0" distB="0" distL="0" distR="0" wp14:anchorId="100A988E" wp14:editId="018B4234">
+          <wp:inline distT="0" distB="0" distL="0" distR="0" wp14:anchorId="6BD94F8C" wp14:editId="0ACDA24D">
             <wp:extent cx="4527510" cy="4319999"/>
             <wp:effectExtent l="0" t="0" r="0" b="0"/>
             <wp:docPr id="13" name="Picture 13"/>
@@ -26955,7 +27105,7 @@
           <w:noProof/>
         </w:rPr>
         <w:drawing>
-          <wp:inline distT="0" distB="0" distL="0" distR="0" wp14:anchorId="5677645C" wp14:editId="3D52025A">
+          <wp:inline distT="0" distB="0" distL="0" distR="0" wp14:anchorId="0DD821F1" wp14:editId="379AD658">
             <wp:extent cx="4440256" cy="4319999"/>
             <wp:effectExtent l="0" t="0" r="0" b="0"/>
             <wp:docPr id="14" name="Picture 14"/>
@@ -27019,7 +27169,7 @@
         </w:rPr>
         <w:lastRenderedPageBreak/>
         <w:drawing>
-          <wp:inline distT="0" distB="0" distL="0" distR="0" wp14:anchorId="0E310F57" wp14:editId="0B262B84">
+          <wp:inline distT="0" distB="0" distL="0" distR="0" wp14:anchorId="4A1DC5DC" wp14:editId="733C653B">
             <wp:extent cx="4992616" cy="4320000"/>
             <wp:effectExtent l="0" t="0" r="0" b="0"/>
             <wp:docPr id="15" name="Picture 15"/>
@@ -27082,7 +27232,7 @@
       <w:pPr>
         <w:pStyle w:val="Heading2"/>
       </w:pPr>
-      <w:bookmarkStart w:id="50" w:name="_Toc244113381"/>
+      <w:bookmarkStart w:id="50" w:name="_Toc244113889"/>
       <w:r>
         <w:t>5.3. Chi</w:t>
       </w:r>
@@ -28708,7 +28858,7 @@
       <w:pPr>
         <w:pStyle w:val="Heading1"/>
       </w:pPr>
-      <w:bookmarkStart w:id="52" w:name="_Toc244113382"/>
+      <w:bookmarkStart w:id="52" w:name="_Toc244113890"/>
       <w:r>
         <w:t>Chương 6. Cài đ</w:t>
       </w:r>
@@ -28742,7 +28892,7 @@
       <w:pPr>
         <w:pStyle w:val="Heading2"/>
       </w:pPr>
-      <w:bookmarkStart w:id="53" w:name="_Toc244113383"/>
+      <w:bookmarkStart w:id="53" w:name="_Toc244113891"/>
       <w:r>
         <w:t>6.1. JDBC, Flyway và Prisma trong m</w:t>
       </w:r>
@@ -29305,7 +29455,7 @@
         </w:rPr>
         <w:lastRenderedPageBreak/>
         <w:drawing>
-          <wp:inline distT="0" distB="0" distL="0" distR="0" wp14:anchorId="52600F30" wp14:editId="4A339308">
+          <wp:inline distT="0" distB="0" distL="0" distR="0" wp14:anchorId="6F04803E" wp14:editId="1AB8B573">
             <wp:extent cx="5832000" cy="3280500"/>
             <wp:effectExtent l="0" t="0" r="0" b="0"/>
             <wp:docPr id="16" name="Picture 16"/>
@@ -29374,7 +29524,7 @@
       <w:pPr>
         <w:pStyle w:val="Heading2"/>
       </w:pPr>
-      <w:bookmarkStart w:id="55" w:name="_Toc244113384"/>
+      <w:bookmarkStart w:id="55" w:name="_Toc244113892"/>
       <w:r>
         <w:t>6.2. Phân b</w:t>
       </w:r>
@@ -29873,7 +30023,7 @@
       <w:pPr>
         <w:pStyle w:val="Heading2"/>
       </w:pPr>
-      <w:bookmarkStart w:id="56" w:name="_Toc244113385"/>
+      <w:bookmarkStart w:id="56" w:name="_Toc244113893"/>
       <w:r>
         <w:t>6.3. Ki</w:t>
       </w:r>
@@ -30165,7 +30315,7 @@
         </w:rPr>
         <w:lastRenderedPageBreak/>
         <w:drawing>
-          <wp:inline distT="0" distB="0" distL="0" distR="0" wp14:anchorId="379C77A4" wp14:editId="08A6B156">
+          <wp:inline distT="0" distB="0" distL="0" distR="0" wp14:anchorId="3B15B80C" wp14:editId="4B4271D6">
             <wp:extent cx="5832000" cy="3280500"/>
             <wp:effectExtent l="0" t="0" r="0" b="0"/>
             <wp:docPr id="17" name="Picture 17"/>
@@ -30501,7 +30651,7 @@
       <w:pPr>
         <w:pStyle w:val="Heading2"/>
       </w:pPr>
-      <w:bookmarkStart w:id="58" w:name="_Toc244113386"/>
+      <w:bookmarkStart w:id="58" w:name="_Toc244113894"/>
       <w:r>
         <w:t>6.4. Tìm ki</w:t>
       </w:r>
@@ -31121,7 +31271,7 @@
       <w:pPr>
         <w:pStyle w:val="Heading2"/>
       </w:pPr>
-      <w:bookmarkStart w:id="59" w:name="_Toc244113387"/>
+      <w:bookmarkStart w:id="59" w:name="_Toc244113895"/>
       <w:r>
         <w:lastRenderedPageBreak/>
         <w:t>6.5. Outbox, retry và gi</w:t>
@@ -32687,7 +32837,7 @@
       <w:pPr>
         <w:pStyle w:val="Heading1"/>
       </w:pPr>
-      <w:bookmarkStart w:id="61" w:name="_Toc244113388"/>
+      <w:bookmarkStart w:id="61" w:name="_Toc244113896"/>
       <w:r>
         <w:t>Chương 7. Ki</w:t>
       </w:r>
@@ -32709,7 +32859,7 @@
       <w:pPr>
         <w:pStyle w:val="Heading2"/>
       </w:pPr>
-      <w:bookmarkStart w:id="62" w:name="_Toc244113389"/>
+      <w:bookmarkStart w:id="62" w:name="_Toc244113897"/>
       <w:r>
         <w:t>7.1. Phương pháp và phân bi</w:t>
       </w:r>
@@ -34930,7 +35080,7 @@
       <w:pPr>
         <w:pStyle w:val="Heading2"/>
       </w:pPr>
-      <w:bookmarkStart w:id="64" w:name="_Toc244113390"/>
+      <w:bookmarkStart w:id="64" w:name="_Toc244113898"/>
       <w:r>
         <w:t>7.2. B</w:t>
       </w:r>
@@ -37406,7 +37556,7 @@
       <w:pPr>
         <w:pStyle w:val="Heading2"/>
       </w:pPr>
-      <w:bookmarkStart w:id="66" w:name="_Toc244113391"/>
+      <w:bookmarkStart w:id="66" w:name="_Toc244113899"/>
       <w:r>
         <w:t>7.3. Giao di</w:t>
       </w:r>
@@ -37595,7 +37745,7 @@
           <w:noProof/>
         </w:rPr>
         <w:drawing>
-          <wp:inline distT="0" distB="0" distL="0" distR="0" wp14:anchorId="7DEDF326" wp14:editId="2C9600E0">
+          <wp:inline distT="0" distB="0" distL="0" distR="0" wp14:anchorId="4F15F18A" wp14:editId="17E009F6">
             <wp:extent cx="5832000" cy="3790800"/>
             <wp:effectExtent l="0" t="0" r="0" b="0"/>
             <wp:docPr id="18" name="Picture 18"/>
@@ -37653,7 +37803,7 @@
         </w:rPr>
         <w:lastRenderedPageBreak/>
         <w:drawing>
-          <wp:inline distT="0" distB="0" distL="0" distR="0" wp14:anchorId="11AC65D3" wp14:editId="1DCAF7F7">
+          <wp:inline distT="0" distB="0" distL="0" distR="0" wp14:anchorId="08EAD925" wp14:editId="34990B74">
             <wp:extent cx="1736907" cy="4319999"/>
             <wp:effectExtent l="0" t="0" r="0" b="0"/>
             <wp:docPr id="19" name="Picture 19"/>
@@ -38019,7 +38169,7 @@
       <w:pPr>
         <w:pStyle w:val="Heading1"/>
       </w:pPr>
-      <w:bookmarkStart w:id="69" w:name="_Toc244113392"/>
+      <w:bookmarkStart w:id="69" w:name="_Toc244113900"/>
       <w:r>
         <w:t>Chương 8. B</w:t>
       </w:r>
@@ -38059,7 +38209,7 @@
       <w:pPr>
         <w:pStyle w:val="Heading2"/>
       </w:pPr>
-      <w:bookmarkStart w:id="70" w:name="_Toc244113393"/>
+      <w:bookmarkStart w:id="70" w:name="_Toc244113901"/>
       <w:r>
         <w:t>8.1. Ki</w:t>
       </w:r>
@@ -39503,7 +39653,7 @@
       <w:pPr>
         <w:pStyle w:val="Heading2"/>
       </w:pPr>
-      <w:bookmarkStart w:id="72" w:name="_Toc244113394"/>
+      <w:bookmarkStart w:id="72" w:name="_Toc244113902"/>
       <w:r>
         <w:t>8.2. D</w:t>
       </w:r>
@@ -40074,7 +40224,7 @@
       <w:pPr>
         <w:pStyle w:val="Heading2"/>
       </w:pPr>
-      <w:bookmarkStart w:id="73" w:name="_Toc244113395"/>
+      <w:bookmarkStart w:id="73" w:name="_Toc244113903"/>
       <w:r>
         <w:t>8.3. Đ</w:t>
       </w:r>
@@ -40506,7 +40656,7 @@
       <w:pPr>
         <w:pStyle w:val="Heading1"/>
       </w:pPr>
-      <w:bookmarkStart w:id="74" w:name="_Toc244113396"/>
+      <w:bookmarkStart w:id="74" w:name="_Toc244113904"/>
       <w:r>
         <w:t>Chương 9. K</w:t>
       </w:r>
@@ -40552,7 +40702,7 @@
       <w:pPr>
         <w:pStyle w:val="Heading2"/>
       </w:pPr>
-      <w:bookmarkStart w:id="75" w:name="_Toc244113397"/>
+      <w:bookmarkStart w:id="75" w:name="_Toc244113905"/>
       <w:r>
         <w:t>9.1. K</w:t>
       </w:r>
@@ -40868,7 +41018,7 @@
       <w:pPr>
         <w:pStyle w:val="Heading2"/>
       </w:pPr>
-      <w:bookmarkStart w:id="76" w:name="_Toc244113398"/>
+      <w:bookmarkStart w:id="76" w:name="_Toc244113906"/>
       <w:r>
         <w:t>9.2. Gi</w:t>
       </w:r>
@@ -41448,7 +41598,7 @@
       <w:pPr>
         <w:pStyle w:val="Heading2"/>
       </w:pPr>
-      <w:bookmarkStart w:id="77" w:name="_Toc244113399"/>
+      <w:bookmarkStart w:id="77" w:name="_Toc244113907"/>
       <w:r>
         <w:t>9.3. K</w:t>
       </w:r>
@@ -41850,7 +42000,7 @@
       <w:pPr>
         <w:pStyle w:val="Heading1"/>
       </w:pPr>
-      <w:bookmarkStart w:id="78" w:name="_Toc244113400"/>
+      <w:bookmarkStart w:id="78" w:name="_Toc244113908"/>
       <w:r>
         <w:t>Tài li</w:t>
       </w:r>
@@ -42273,7 +42423,7 @@
       <w:pPr>
         <w:pStyle w:val="Heading1"/>
       </w:pPr>
-      <w:bookmarkStart w:id="79" w:name="_Toc244113401"/>
+      <w:bookmarkStart w:id="79" w:name="_Toc244113909"/>
       <w:r>
         <w:t>Ph</w:t>
       </w:r>
@@ -42295,7 +42445,7 @@
       <w:pPr>
         <w:pStyle w:val="Heading2"/>
       </w:pPr>
-      <w:bookmarkStart w:id="80" w:name="_Toc244113402"/>
+      <w:bookmarkStart w:id="80" w:name="_Toc244113910"/>
       <w:r>
         <w:t>Ph</w:t>
       </w:r>
@@ -42476,9 +42626,1461 @@
     </w:p>
     <w:p>
       <w:pPr>
+        <w:pStyle w:val="Caption"/>
+        <w:keepNext/>
+      </w:pPr>
+      <w:bookmarkStart w:id="81" w:name="tab-14"/>
+      <w:r>
+        <w:t>B</w:t>
+      </w:r>
+      <w:r>
+        <w:t>ả</w:t>
+      </w:r>
+      <w:r>
+        <w:t>ng 14. Các nhóm b</w:t>
+      </w:r>
+      <w:r>
+        <w:t>ả</w:t>
+      </w:r>
+      <w:r>
+        <w:t>ng Core có trong Flyway t</w:t>
+      </w:r>
+      <w:r>
+        <w:t>ạ</w:t>
+      </w:r>
+      <w:r>
+        <w:t>i m</w:t>
+      </w:r>
+      <w:r>
+        <w:t>ố</w:t>
+      </w:r>
+      <w:r>
+        <w:t>c kh</w:t>
+      </w:r>
+      <w:r>
+        <w:t>ả</w:t>
+      </w:r>
+      <w:r>
+        <w:t>o sát.</w:t>
+      </w:r>
+      <w:bookmarkEnd w:id="81"/>
+    </w:p>
+    <w:tbl>
+      <w:tblPr>
+        <w:tblW w:w="0" w:type="auto"/>
+        <w:tblBorders>
+          <w:top w:val="single" w:sz="4" w:space="0" w:color="D9D9D9"/>
+          <w:left w:val="single" w:sz="4" w:space="0" w:color="D9D9D9"/>
+          <w:bottom w:val="single" w:sz="4" w:space="0" w:color="D9D9D9"/>
+          <w:right w:val="single" w:sz="4" w:space="0" w:color="D9D9D9"/>
+          <w:insideH w:val="single" w:sz="4" w:space="0" w:color="D9D9D9"/>
+          <w:insideV w:val="single" w:sz="4" w:space="0" w:color="D9D9D9"/>
+        </w:tblBorders>
+        <w:tblLayout w:type="fixed"/>
+        <w:tblLook w:val="04A0" w:firstRow="1" w:lastRow="0" w:firstColumn="1" w:lastColumn="0" w:noHBand="0" w:noVBand="1"/>
+      </w:tblPr>
+      <w:tblGrid>
+        <w:gridCol w:w="2551"/>
+        <w:gridCol w:w="3685"/>
+        <w:gridCol w:w="2948"/>
+      </w:tblGrid>
+      <w:tr>
+        <w:trPr>
+          <w:cantSplit/>
+          <w:tblHeader/>
+        </w:trPr>
+        <w:tc>
+          <w:tcPr>
+            <w:tcW w:w="2551" w:type="dxa"/>
+            <w:shd w:val="clear" w:color="auto" w:fill="1B365E"/>
+            <w:tcMar>
+              <w:top w:w="100" w:type="dxa"/>
+              <w:left w:w="100" w:type="dxa"/>
+              <w:bottom w:w="100" w:type="dxa"/>
+              <w:right w:w="100" w:type="dxa"/>
+            </w:tcMar>
+            <w:vAlign w:val="center"/>
+          </w:tcPr>
+          <w:p>
+            <w:pPr>
+              <w:keepNext/>
+              <w:keepLines/>
+              <w:spacing w:after="60"/>
+            </w:pPr>
+            <w:r>
+              <w:rPr>
+                <w:b/>
+                <w:color w:val="FFFFFF"/>
+                <w:sz w:val="21"/>
+              </w:rPr>
+              <w:t>Nhóm</w:t>
+            </w:r>
+          </w:p>
+        </w:tc>
+        <w:tc>
+          <w:tcPr>
+            <w:tcW w:w="3685" w:type="dxa"/>
+            <w:shd w:val="clear" w:color="auto" w:fill="1B365E"/>
+            <w:tcMar>
+              <w:top w:w="100" w:type="dxa"/>
+              <w:left w:w="100" w:type="dxa"/>
+              <w:bottom w:w="100" w:type="dxa"/>
+              <w:right w:w="100" w:type="dxa"/>
+            </w:tcMar>
+            <w:vAlign w:val="center"/>
+          </w:tcPr>
+          <w:p>
+            <w:pPr>
+              <w:keepNext/>
+              <w:keepLines/>
+              <w:spacing w:after="60"/>
+            </w:pPr>
+            <w:r>
+              <w:rPr>
+                <w:b/>
+                <w:color w:val="FFFFFF"/>
+                <w:sz w:val="21"/>
+              </w:rPr>
+              <w:t>B</w:t>
+            </w:r>
+            <w:r>
+              <w:rPr>
+                <w:b/>
+                <w:color w:val="FFFFFF"/>
+                <w:sz w:val="21"/>
+              </w:rPr>
+              <w:t>ả</w:t>
+            </w:r>
+            <w:r>
+              <w:rPr>
+                <w:b/>
+                <w:color w:val="FFFFFF"/>
+                <w:sz w:val="21"/>
+              </w:rPr>
+              <w:t>ng đang có trong migration</w:t>
+            </w:r>
+          </w:p>
+        </w:tc>
+        <w:tc>
+          <w:tcPr>
+            <w:tcW w:w="2948" w:type="dxa"/>
+            <w:shd w:val="clear" w:color="auto" w:fill="1B365E"/>
+            <w:tcMar>
+              <w:top w:w="100" w:type="dxa"/>
+              <w:left w:w="100" w:type="dxa"/>
+              <w:bottom w:w="100" w:type="dxa"/>
+              <w:right w:w="100" w:type="dxa"/>
+            </w:tcMar>
+            <w:vAlign w:val="center"/>
+          </w:tcPr>
+          <w:p>
+            <w:pPr>
+              <w:keepNext/>
+              <w:keepLines/>
+              <w:spacing w:after="60"/>
+            </w:pPr>
+            <w:r>
+              <w:rPr>
+                <w:b/>
+                <w:color w:val="FFFFFF"/>
+                <w:sz w:val="21"/>
+              </w:rPr>
+              <w:t>Vai trò</w:t>
+            </w:r>
+          </w:p>
+        </w:tc>
+      </w:tr>
+      <w:tr>
+        <w:trPr>
+          <w:cantSplit/>
+        </w:trPr>
+        <w:tc>
+          <w:tcPr>
+            <w:tcW w:w="2551" w:type="dxa"/>
+            <w:shd w:val="clear" w:color="auto" w:fill="FFFFFF"/>
+            <w:tcMar>
+              <w:top w:w="100" w:type="dxa"/>
+              <w:left w:w="100" w:type="dxa"/>
+              <w:bottom w:w="100" w:type="dxa"/>
+              <w:right w:w="100" w:type="dxa"/>
+            </w:tcMar>
+            <w:vAlign w:val="center"/>
+          </w:tcPr>
+          <w:p>
+            <w:pPr>
+              <w:keepLines/>
+              <w:spacing w:after="60"/>
+            </w:pPr>
+            <w:r>
+              <w:rPr>
+                <w:sz w:val="21"/>
+              </w:rPr>
+              <w:t>H</w:t>
+            </w:r>
+            <w:r>
+              <w:rPr>
+                <w:sz w:val="21"/>
+              </w:rPr>
+              <w:t>ạ</w:t>
+            </w:r>
+            <w:r>
+              <w:rPr>
+                <w:sz w:val="21"/>
+              </w:rPr>
+              <w:t xml:space="preserve"> t</w:t>
+            </w:r>
+            <w:r>
+              <w:rPr>
+                <w:sz w:val="21"/>
+              </w:rPr>
+              <w:t>ầ</w:t>
+            </w:r>
+            <w:r>
+              <w:rPr>
+                <w:sz w:val="21"/>
+              </w:rPr>
+              <w:t>ng và danh tính</w:t>
+            </w:r>
+          </w:p>
+        </w:tc>
+        <w:tc>
+          <w:tcPr>
+            <w:tcW w:w="3685" w:type="dxa"/>
+            <w:shd w:val="clear" w:color="auto" w:fill="FFFFFF"/>
+            <w:tcMar>
+              <w:top w:w="100" w:type="dxa"/>
+              <w:left w:w="100" w:type="dxa"/>
+              <w:bottom w:w="100" w:type="dxa"/>
+              <w:right w:w="100" w:type="dxa"/>
+            </w:tcMar>
+            <w:vAlign w:val="center"/>
+          </w:tcPr>
+          <w:p>
+            <w:pPr>
+              <w:keepLines/>
+              <w:spacing w:after="60"/>
+            </w:pPr>
+            <w:r>
+              <w:rPr>
+                <w:rFonts w:ascii="Consolas" w:hAnsi="Consolas"/>
+                <w:sz w:val="21"/>
+              </w:rPr>
+              <w:t>system_metadata</w:t>
+            </w:r>
+            <w:r>
+              <w:rPr>
+                <w:sz w:val="21"/>
+              </w:rPr>
+              <w:t xml:space="preserve">, </w:t>
+            </w:r>
+            <w:r>
+              <w:rPr>
+                <w:rFonts w:ascii="Consolas" w:hAnsi="Consolas"/>
+                <w:sz w:val="21"/>
+              </w:rPr>
+              <w:t>outbox_events</w:t>
+            </w:r>
+            <w:r>
+              <w:rPr>
+                <w:sz w:val="21"/>
+              </w:rPr>
+              <w:t xml:space="preserve">, </w:t>
+            </w:r>
+            <w:r>
+              <w:rPr>
+                <w:rFonts w:ascii="Consolas" w:hAnsi="Consolas"/>
+                <w:sz w:val="21"/>
+              </w:rPr>
+              <w:t>users</w:t>
+            </w:r>
+            <w:r>
+              <w:rPr>
+                <w:sz w:val="21"/>
+              </w:rPr>
+              <w:t xml:space="preserve">, </w:t>
+            </w:r>
+            <w:r>
+              <w:rPr>
+                <w:rFonts w:ascii="Consolas" w:hAnsi="Consolas"/>
+                <w:sz w:val="21"/>
+              </w:rPr>
+              <w:t>roles</w:t>
+            </w:r>
+            <w:r>
+              <w:rPr>
+                <w:sz w:val="21"/>
+              </w:rPr>
+              <w:t xml:space="preserve">, </w:t>
+            </w:r>
+            <w:r>
+              <w:rPr>
+                <w:rFonts w:ascii="Consolas" w:hAnsi="Consolas"/>
+                <w:sz w:val="21"/>
+              </w:rPr>
+              <w:t>user_roles</w:t>
+            </w:r>
+            <w:r>
+              <w:rPr>
+                <w:sz w:val="21"/>
+              </w:rPr>
+              <w:t xml:space="preserve">, </w:t>
+            </w:r>
+            <w:r>
+              <w:rPr>
+                <w:rFonts w:ascii="Consolas" w:hAnsi="Consolas"/>
+                <w:sz w:val="21"/>
+              </w:rPr>
+              <w:t>refresh_tokens</w:t>
+            </w:r>
+            <w:r>
+              <w:rPr>
+                <w:sz w:val="21"/>
+              </w:rPr>
+              <w:t xml:space="preserve">, </w:t>
+            </w:r>
+            <w:r>
+              <w:rPr>
+                <w:rFonts w:ascii="Consolas" w:hAnsi="Consolas"/>
+                <w:sz w:val="21"/>
+              </w:rPr>
+              <w:t>account_admin_audit</w:t>
+            </w:r>
+            <w:r>
+              <w:rPr>
+                <w:sz w:val="21"/>
+              </w:rPr>
+              <w:t xml:space="preserve">, </w:t>
+            </w:r>
+            <w:r>
+              <w:rPr>
+                <w:rFonts w:ascii="Consolas" w:hAnsi="Consolas"/>
+                <w:sz w:val="21"/>
+              </w:rPr>
+              <w:t>user_ui_preferences</w:t>
+            </w:r>
+          </w:p>
+        </w:tc>
+        <w:tc>
+          <w:tcPr>
+            <w:tcW w:w="2948" w:type="dxa"/>
+            <w:shd w:val="clear" w:color="auto" w:fill="FFFFFF"/>
+            <w:tcMar>
+              <w:top w:w="100" w:type="dxa"/>
+              <w:left w:w="100" w:type="dxa"/>
+              <w:bottom w:w="100" w:type="dxa"/>
+              <w:right w:w="100" w:type="dxa"/>
+            </w:tcMar>
+            <w:vAlign w:val="center"/>
+          </w:tcPr>
+          <w:p>
+            <w:pPr>
+              <w:keepLines/>
+              <w:spacing w:after="60"/>
+            </w:pPr>
+            <w:r>
+              <w:rPr>
+                <w:sz w:val="21"/>
+              </w:rPr>
+              <w:t>Version, s</w:t>
+            </w:r>
+            <w:r>
+              <w:rPr>
+                <w:sz w:val="21"/>
+              </w:rPr>
+              <w:t>ự</w:t>
+            </w:r>
+            <w:r>
+              <w:rPr>
+                <w:sz w:val="21"/>
+              </w:rPr>
+              <w:t xml:space="preserve"> ki</w:t>
+            </w:r>
+            <w:r>
+              <w:rPr>
+                <w:sz w:val="21"/>
+              </w:rPr>
+              <w:t>ệ</w:t>
+            </w:r>
+            <w:r>
+              <w:rPr>
+                <w:sz w:val="21"/>
+              </w:rPr>
+              <w:t>n, phiên, quy</w:t>
+            </w:r>
+            <w:r>
+              <w:rPr>
+                <w:sz w:val="21"/>
+              </w:rPr>
+              <w:t>ề</w:t>
+            </w:r>
+            <w:r>
+              <w:rPr>
+                <w:sz w:val="21"/>
+              </w:rPr>
+              <w:t>n, quy</w:t>
+            </w:r>
+            <w:r>
+              <w:rPr>
+                <w:sz w:val="21"/>
+              </w:rPr>
+              <w:t>ế</w:t>
+            </w:r>
+            <w:r>
+              <w:rPr>
+                <w:sz w:val="21"/>
+              </w:rPr>
+              <w:t>t đ</w:t>
+            </w:r>
+            <w:r>
+              <w:rPr>
+                <w:sz w:val="21"/>
+              </w:rPr>
+              <w:t>ị</w:t>
+            </w:r>
+            <w:r>
+              <w:rPr>
+                <w:sz w:val="21"/>
+              </w:rPr>
+              <w:t>nh qu</w:t>
+            </w:r>
+            <w:r>
+              <w:rPr>
+                <w:sz w:val="21"/>
+              </w:rPr>
+              <w:t>ả</w:t>
+            </w:r>
+            <w:r>
+              <w:rPr>
+                <w:sz w:val="21"/>
+              </w:rPr>
+              <w:t>n tr</w:t>
+            </w:r>
+            <w:r>
+              <w:rPr>
+                <w:sz w:val="21"/>
+              </w:rPr>
+              <w:t>ị</w:t>
+            </w:r>
+            <w:r>
+              <w:rPr>
+                <w:sz w:val="21"/>
+              </w:rPr>
+              <w:t xml:space="preserve"> và preset giao di</w:t>
+            </w:r>
+            <w:r>
+              <w:rPr>
+                <w:sz w:val="21"/>
+              </w:rPr>
+              <w:t>ệ</w:t>
+            </w:r>
+            <w:r>
+              <w:rPr>
+                <w:sz w:val="21"/>
+              </w:rPr>
+              <w:t>n.</w:t>
+            </w:r>
+          </w:p>
+        </w:tc>
+      </w:tr>
+      <w:tr>
+        <w:trPr>
+          <w:cantSplit/>
+        </w:trPr>
+        <w:tc>
+          <w:tcPr>
+            <w:tcW w:w="2551" w:type="dxa"/>
+            <w:shd w:val="clear" w:color="auto" w:fill="F1F5FA"/>
+            <w:tcMar>
+              <w:top w:w="100" w:type="dxa"/>
+              <w:left w:w="100" w:type="dxa"/>
+              <w:bottom w:w="100" w:type="dxa"/>
+              <w:right w:w="100" w:type="dxa"/>
+            </w:tcMar>
+            <w:vAlign w:val="center"/>
+          </w:tcPr>
+          <w:p>
+            <w:pPr>
+              <w:keepLines/>
+              <w:spacing w:after="60"/>
+            </w:pPr>
+            <w:r>
+              <w:rPr>
+                <w:sz w:val="21"/>
+              </w:rPr>
+              <w:t>Catalog</w:t>
+            </w:r>
+          </w:p>
+        </w:tc>
+        <w:tc>
+          <w:tcPr>
+            <w:tcW w:w="3685" w:type="dxa"/>
+            <w:shd w:val="clear" w:color="auto" w:fill="F1F5FA"/>
+            <w:tcMar>
+              <w:top w:w="100" w:type="dxa"/>
+              <w:left w:w="100" w:type="dxa"/>
+              <w:bottom w:w="100" w:type="dxa"/>
+              <w:right w:w="100" w:type="dxa"/>
+            </w:tcMar>
+            <w:vAlign w:val="center"/>
+          </w:tcPr>
+          <w:p>
+            <w:pPr>
+              <w:keepLines/>
+              <w:spacing w:after="60"/>
+            </w:pPr>
+            <w:r>
+              <w:rPr>
+                <w:rFonts w:ascii="Consolas" w:hAnsi="Consolas"/>
+                <w:sz w:val="21"/>
+              </w:rPr>
+              <w:t>authors</w:t>
+            </w:r>
+            <w:r>
+              <w:rPr>
+                <w:sz w:val="21"/>
+              </w:rPr>
+              <w:t xml:space="preserve">, </w:t>
+            </w:r>
+            <w:r>
+              <w:rPr>
+                <w:rFonts w:ascii="Consolas" w:hAnsi="Consolas"/>
+                <w:sz w:val="21"/>
+              </w:rPr>
+              <w:t>categories</w:t>
+            </w:r>
+            <w:r>
+              <w:rPr>
+                <w:sz w:val="21"/>
+              </w:rPr>
+              <w:t xml:space="preserve">, </w:t>
+            </w:r>
+            <w:r>
+              <w:rPr>
+                <w:rFonts w:ascii="Consolas" w:hAnsi="Consolas"/>
+                <w:sz w:val="21"/>
+              </w:rPr>
+              <w:t>publishers</w:t>
+            </w:r>
+            <w:r>
+              <w:rPr>
+                <w:sz w:val="21"/>
+              </w:rPr>
+              <w:t xml:space="preserve">, </w:t>
+            </w:r>
+            <w:r>
+              <w:rPr>
+                <w:rFonts w:ascii="Consolas" w:hAnsi="Consolas"/>
+                <w:sz w:val="21"/>
+              </w:rPr>
+              <w:t>books</w:t>
+            </w:r>
+            <w:r>
+              <w:rPr>
+                <w:sz w:val="21"/>
+              </w:rPr>
+              <w:t xml:space="preserve">, </w:t>
+            </w:r>
+            <w:r>
+              <w:rPr>
+                <w:rFonts w:ascii="Consolas" w:hAnsi="Consolas"/>
+                <w:sz w:val="21"/>
+              </w:rPr>
+              <w:t>book_authors</w:t>
+            </w:r>
+            <w:r>
+              <w:rPr>
+                <w:sz w:val="21"/>
+              </w:rPr>
+              <w:t xml:space="preserve">, </w:t>
+            </w:r>
+            <w:r>
+              <w:rPr>
+                <w:rFonts w:ascii="Consolas" w:hAnsi="Consolas"/>
+                <w:sz w:val="21"/>
+              </w:rPr>
+              <w:t>book_categories</w:t>
+            </w:r>
+            <w:r>
+              <w:rPr>
+                <w:sz w:val="21"/>
+              </w:rPr>
+              <w:t xml:space="preserve">, </w:t>
+            </w:r>
+            <w:r>
+              <w:rPr>
+                <w:rFonts w:ascii="Consolas" w:hAnsi="Consolas"/>
+                <w:sz w:val="21"/>
+              </w:rPr>
+              <w:t>editions</w:t>
+            </w:r>
+            <w:r>
+              <w:rPr>
+                <w:sz w:val="21"/>
+              </w:rPr>
+              <w:t xml:space="preserve">, </w:t>
+            </w:r>
+            <w:r>
+              <w:rPr>
+                <w:rFonts w:ascii="Consolas" w:hAnsi="Consolas"/>
+                <w:sz w:val="21"/>
+              </w:rPr>
+              <w:t>catalog_media_references</w:t>
+            </w:r>
+            <w:r>
+              <w:rPr>
+                <w:sz w:val="21"/>
+              </w:rPr>
+              <w:t xml:space="preserve">, </w:t>
+            </w:r>
+            <w:r>
+              <w:rPr>
+                <w:rFonts w:ascii="Consolas" w:hAnsi="Consolas"/>
+                <w:sz w:val="21"/>
+              </w:rPr>
+              <w:t>category_aliases</w:t>
+            </w:r>
+            <w:r>
+              <w:rPr>
+                <w:sz w:val="21"/>
+              </w:rPr>
+              <w:t xml:space="preserve">, </w:t>
+            </w:r>
+            <w:r>
+              <w:rPr>
+                <w:rFonts w:ascii="Consolas" w:hAnsi="Consolas"/>
+                <w:sz w:val="21"/>
+              </w:rPr>
+              <w:t>catalog_external_sources</w:t>
+            </w:r>
+          </w:p>
+        </w:tc>
+        <w:tc>
+          <w:tcPr>
+            <w:tcW w:w="2948" w:type="dxa"/>
+            <w:shd w:val="clear" w:color="auto" w:fill="F1F5FA"/>
+            <w:tcMar>
+              <w:top w:w="100" w:type="dxa"/>
+              <w:left w:w="100" w:type="dxa"/>
+              <w:bottom w:w="100" w:type="dxa"/>
+              <w:right w:w="100" w:type="dxa"/>
+            </w:tcMar>
+            <w:vAlign w:val="center"/>
+          </w:tcPr>
+          <w:p>
+            <w:pPr>
+              <w:keepLines/>
+              <w:spacing w:after="60"/>
+            </w:pPr>
+            <w:r>
+              <w:rPr>
+                <w:sz w:val="21"/>
+              </w:rPr>
+              <w:t>Tác ph</w:t>
+            </w:r>
+            <w:r>
+              <w:rPr>
+                <w:sz w:val="21"/>
+              </w:rPr>
+              <w:t>ẩ</w:t>
+            </w:r>
+            <w:r>
+              <w:rPr>
+                <w:sz w:val="21"/>
+              </w:rPr>
+              <w:t>m, phân lo</w:t>
+            </w:r>
+            <w:r>
+              <w:rPr>
+                <w:sz w:val="21"/>
+              </w:rPr>
+              <w:t>ạ</w:t>
+            </w:r>
+            <w:r>
+              <w:rPr>
+                <w:sz w:val="21"/>
+              </w:rPr>
+              <w:t xml:space="preserve">i, </w:t>
+            </w:r>
+            <w:r>
+              <w:rPr>
+                <w:sz w:val="21"/>
+              </w:rPr>
+              <w:t>ấ</w:t>
+            </w:r>
+            <w:r>
+              <w:rPr>
+                <w:sz w:val="21"/>
+              </w:rPr>
+              <w:t>n b</w:t>
+            </w:r>
+            <w:r>
+              <w:rPr>
+                <w:sz w:val="21"/>
+              </w:rPr>
+              <w:t>ả</w:t>
+            </w:r>
+            <w:r>
+              <w:rPr>
+                <w:sz w:val="21"/>
+              </w:rPr>
+              <w:t>n, ngu</w:t>
+            </w:r>
+            <w:r>
+              <w:rPr>
+                <w:sz w:val="21"/>
+              </w:rPr>
+              <w:t>ồ</w:t>
+            </w:r>
+            <w:r>
+              <w:rPr>
+                <w:sz w:val="21"/>
+              </w:rPr>
+              <w:t>n và media đã duy</w:t>
+            </w:r>
+            <w:r>
+              <w:rPr>
+                <w:sz w:val="21"/>
+              </w:rPr>
+              <w:t>ệ</w:t>
+            </w:r>
+            <w:r>
+              <w:rPr>
+                <w:sz w:val="21"/>
+              </w:rPr>
+              <w:t>t.</w:t>
+            </w:r>
+          </w:p>
+        </w:tc>
+      </w:tr>
+      <w:tr>
+        <w:trPr>
+          <w:cantSplit/>
+        </w:trPr>
+        <w:tc>
+          <w:tcPr>
+            <w:tcW w:w="2551" w:type="dxa"/>
+            <w:shd w:val="clear" w:color="auto" w:fill="FFFFFF"/>
+            <w:tcMar>
+              <w:top w:w="100" w:type="dxa"/>
+              <w:left w:w="100" w:type="dxa"/>
+              <w:bottom w:w="100" w:type="dxa"/>
+              <w:right w:w="100" w:type="dxa"/>
+            </w:tcMar>
+            <w:vAlign w:val="center"/>
+          </w:tcPr>
+          <w:p>
+            <w:pPr>
+              <w:keepLines/>
+              <w:spacing w:after="60"/>
+            </w:pPr>
+            <w:r>
+              <w:rPr>
+                <w:sz w:val="21"/>
+              </w:rPr>
+              <w:t>Đ</w:t>
+            </w:r>
+            <w:r>
+              <w:rPr>
+                <w:sz w:val="21"/>
+              </w:rPr>
+              <w:t>ị</w:t>
+            </w:r>
+            <w:r>
+              <w:rPr>
+                <w:sz w:val="21"/>
+              </w:rPr>
+              <w:t>a đi</w:t>
+            </w:r>
+            <w:r>
+              <w:rPr>
+                <w:sz w:val="21"/>
+              </w:rPr>
+              <w:t>ể</w:t>
+            </w:r>
+            <w:r>
+              <w:rPr>
+                <w:sz w:val="21"/>
+              </w:rPr>
+              <w:t>m, b</w:t>
+            </w:r>
+            <w:r>
+              <w:rPr>
+                <w:sz w:val="21"/>
+              </w:rPr>
+              <w:t>ả</w:t>
+            </w:r>
+            <w:r>
+              <w:rPr>
+                <w:sz w:val="21"/>
+              </w:rPr>
+              <w:t>n sách và ki</w:t>
+            </w:r>
+            <w:r>
+              <w:rPr>
+                <w:sz w:val="21"/>
+              </w:rPr>
+              <w:t>ể</w:t>
+            </w:r>
+            <w:r>
+              <w:rPr>
+                <w:sz w:val="21"/>
+              </w:rPr>
+              <w:t>m kê</w:t>
+            </w:r>
+          </w:p>
+        </w:tc>
+        <w:tc>
+          <w:tcPr>
+            <w:tcW w:w="3685" w:type="dxa"/>
+            <w:shd w:val="clear" w:color="auto" w:fill="FFFFFF"/>
+            <w:tcMar>
+              <w:top w:w="100" w:type="dxa"/>
+              <w:left w:w="100" w:type="dxa"/>
+              <w:bottom w:w="100" w:type="dxa"/>
+              <w:right w:w="100" w:type="dxa"/>
+            </w:tcMar>
+            <w:vAlign w:val="center"/>
+          </w:tcPr>
+          <w:p>
+            <w:pPr>
+              <w:keepLines/>
+              <w:spacing w:after="60"/>
+            </w:pPr>
+            <w:r>
+              <w:rPr>
+                <w:rFonts w:ascii="Consolas" w:hAnsi="Consolas"/>
+                <w:sz w:val="21"/>
+              </w:rPr>
+              <w:t>branches</w:t>
+            </w:r>
+            <w:r>
+              <w:rPr>
+                <w:sz w:val="21"/>
+              </w:rPr>
+              <w:t xml:space="preserve">, </w:t>
+            </w:r>
+            <w:r>
+              <w:rPr>
+                <w:rFonts w:ascii="Consolas" w:hAnsi="Consolas"/>
+                <w:sz w:val="21"/>
+              </w:rPr>
+              <w:t>shelves</w:t>
+            </w:r>
+            <w:r>
+              <w:rPr>
+                <w:sz w:val="21"/>
+              </w:rPr>
+              <w:t xml:space="preserve">, </w:t>
+            </w:r>
+            <w:r>
+              <w:rPr>
+                <w:rFonts w:ascii="Consolas" w:hAnsi="Consolas"/>
+                <w:sz w:val="21"/>
+              </w:rPr>
+              <w:t>book_copies</w:t>
+            </w:r>
+            <w:r>
+              <w:rPr>
+                <w:sz w:val="21"/>
+              </w:rPr>
+              <w:t xml:space="preserve">, </w:t>
+            </w:r>
+            <w:r>
+              <w:rPr>
+                <w:rFonts w:ascii="Consolas" w:hAnsi="Consolas"/>
+                <w:sz w:val="21"/>
+              </w:rPr>
+              <w:t>inventory_sessions</w:t>
+            </w:r>
+            <w:r>
+              <w:rPr>
+                <w:sz w:val="21"/>
+              </w:rPr>
+              <w:t xml:space="preserve">, </w:t>
+            </w:r>
+            <w:r>
+              <w:rPr>
+                <w:rFonts w:ascii="Consolas" w:hAnsi="Consolas"/>
+                <w:sz w:val="21"/>
+              </w:rPr>
+              <w:t>inventory_snapshots</w:t>
+            </w:r>
+            <w:r>
+              <w:rPr>
+                <w:sz w:val="21"/>
+              </w:rPr>
+              <w:t xml:space="preserve">, </w:t>
+            </w:r>
+            <w:r>
+              <w:rPr>
+                <w:rFonts w:ascii="Consolas" w:hAnsi="Consolas"/>
+                <w:sz w:val="21"/>
+              </w:rPr>
+              <w:t>inventory_scans</w:t>
+            </w:r>
+            <w:r>
+              <w:rPr>
+                <w:sz w:val="21"/>
+              </w:rPr>
+              <w:t xml:space="preserve">, </w:t>
+            </w:r>
+            <w:r>
+              <w:rPr>
+                <w:rFonts w:ascii="Consolas" w:hAnsi="Consolas"/>
+                <w:sz w:val="21"/>
+              </w:rPr>
+              <w:t>inventory_anomalies</w:t>
+            </w:r>
+            <w:r>
+              <w:rPr>
+                <w:sz w:val="21"/>
+              </w:rPr>
+              <w:t xml:space="preserve">, </w:t>
+            </w:r>
+            <w:r>
+              <w:rPr>
+                <w:rFonts w:ascii="Consolas" w:hAnsi="Consolas"/>
+                <w:sz w:val="21"/>
+              </w:rPr>
+              <w:t>inventory_resolutions</w:t>
+            </w:r>
+          </w:p>
+        </w:tc>
+        <w:tc>
+          <w:tcPr>
+            <w:tcW w:w="2948" w:type="dxa"/>
+            <w:shd w:val="clear" w:color="auto" w:fill="FFFFFF"/>
+            <w:tcMar>
+              <w:top w:w="100" w:type="dxa"/>
+              <w:left w:w="100" w:type="dxa"/>
+              <w:bottom w:w="100" w:type="dxa"/>
+              <w:right w:w="100" w:type="dxa"/>
+            </w:tcMar>
+            <w:vAlign w:val="center"/>
+          </w:tcPr>
+          <w:p>
+            <w:pPr>
+              <w:keepLines/>
+              <w:spacing w:after="60"/>
+            </w:pPr>
+            <w:r>
+              <w:rPr>
+                <w:sz w:val="21"/>
+              </w:rPr>
+              <w:t>V</w:t>
+            </w:r>
+            <w:r>
+              <w:rPr>
+                <w:sz w:val="21"/>
+              </w:rPr>
+              <w:t>ị</w:t>
+            </w:r>
+            <w:r>
+              <w:rPr>
+                <w:sz w:val="21"/>
+              </w:rPr>
+              <w:t xml:space="preserve"> trí Copy, snapshot, lư</w:t>
+            </w:r>
+            <w:r>
+              <w:rPr>
+                <w:sz w:val="21"/>
+              </w:rPr>
+              <w:t>ợ</w:t>
+            </w:r>
+            <w:r>
+              <w:rPr>
+                <w:sz w:val="21"/>
+              </w:rPr>
+              <w:t>t quét và quy</w:t>
+            </w:r>
+            <w:r>
+              <w:rPr>
+                <w:sz w:val="21"/>
+              </w:rPr>
+              <w:t>ế</w:t>
+            </w:r>
+            <w:r>
+              <w:rPr>
+                <w:sz w:val="21"/>
+              </w:rPr>
+              <w:t>t đ</w:t>
+            </w:r>
+            <w:r>
+              <w:rPr>
+                <w:sz w:val="21"/>
+              </w:rPr>
+              <w:t>ị</w:t>
+            </w:r>
+            <w:r>
+              <w:rPr>
+                <w:sz w:val="21"/>
+              </w:rPr>
+              <w:t>nh x</w:t>
+            </w:r>
+            <w:r>
+              <w:rPr>
+                <w:sz w:val="21"/>
+              </w:rPr>
+              <w:t>ử</w:t>
+            </w:r>
+            <w:r>
+              <w:rPr>
+                <w:sz w:val="21"/>
+              </w:rPr>
+              <w:t xml:space="preserve"> lý.</w:t>
+            </w:r>
+          </w:p>
+        </w:tc>
+      </w:tr>
+      <w:tr>
+        <w:trPr>
+          <w:cantSplit/>
+        </w:trPr>
+        <w:tc>
+          <w:tcPr>
+            <w:tcW w:w="2551" w:type="dxa"/>
+            <w:shd w:val="clear" w:color="auto" w:fill="F1F5FA"/>
+            <w:tcMar>
+              <w:top w:w="100" w:type="dxa"/>
+              <w:left w:w="100" w:type="dxa"/>
+              <w:bottom w:w="100" w:type="dxa"/>
+              <w:right w:w="100" w:type="dxa"/>
+            </w:tcMar>
+            <w:vAlign w:val="center"/>
+          </w:tcPr>
+          <w:p>
+            <w:pPr>
+              <w:keepLines/>
+              <w:spacing w:after="60"/>
+            </w:pPr>
+            <w:r>
+              <w:rPr>
+                <w:sz w:val="21"/>
+              </w:rPr>
+              <w:t>Lưu thông và gi</w:t>
+            </w:r>
+            <w:r>
+              <w:rPr>
+                <w:sz w:val="21"/>
+              </w:rPr>
+              <w:t>ữ</w:t>
+            </w:r>
+            <w:r>
+              <w:rPr>
+                <w:sz w:val="21"/>
+              </w:rPr>
+              <w:t xml:space="preserve"> ch</w:t>
+            </w:r>
+            <w:r>
+              <w:rPr>
+                <w:sz w:val="21"/>
+              </w:rPr>
+              <w:t>ỗ</w:t>
+            </w:r>
+          </w:p>
+        </w:tc>
+        <w:tc>
+          <w:tcPr>
+            <w:tcW w:w="3685" w:type="dxa"/>
+            <w:shd w:val="clear" w:color="auto" w:fill="F1F5FA"/>
+            <w:tcMar>
+              <w:top w:w="100" w:type="dxa"/>
+              <w:left w:w="100" w:type="dxa"/>
+              <w:bottom w:w="100" w:type="dxa"/>
+              <w:right w:w="100" w:type="dxa"/>
+            </w:tcMar>
+            <w:vAlign w:val="center"/>
+          </w:tcPr>
+          <w:p>
+            <w:pPr>
+              <w:keepLines/>
+              <w:spacing w:after="60"/>
+            </w:pPr>
+            <w:r>
+              <w:rPr>
+                <w:rFonts w:ascii="Consolas" w:hAnsi="Consolas"/>
+                <w:sz w:val="21"/>
+              </w:rPr>
+              <w:t>loans</w:t>
+            </w:r>
+            <w:r>
+              <w:rPr>
+                <w:sz w:val="21"/>
+              </w:rPr>
+              <w:t xml:space="preserve">, </w:t>
+            </w:r>
+            <w:r>
+              <w:rPr>
+                <w:rFonts w:ascii="Consolas" w:hAnsi="Consolas"/>
+                <w:sz w:val="21"/>
+              </w:rPr>
+              <w:t>circulation_requests</w:t>
+            </w:r>
+            <w:r>
+              <w:rPr>
+                <w:sz w:val="21"/>
+              </w:rPr>
+              <w:t xml:space="preserve">, </w:t>
+            </w:r>
+            <w:r>
+              <w:rPr>
+                <w:rFonts w:ascii="Consolas" w:hAnsi="Consolas"/>
+                <w:sz w:val="21"/>
+              </w:rPr>
+              <w:t>copy_state_changes</w:t>
+            </w:r>
+            <w:r>
+              <w:rPr>
+                <w:sz w:val="21"/>
+              </w:rPr>
+              <w:t xml:space="preserve">, </w:t>
+            </w:r>
+            <w:r>
+              <w:rPr>
+                <w:rFonts w:ascii="Consolas" w:hAnsi="Consolas"/>
+                <w:sz w:val="21"/>
+              </w:rPr>
+              <w:t>holds</w:t>
+            </w:r>
+            <w:r>
+              <w:rPr>
+                <w:sz w:val="21"/>
+              </w:rPr>
+              <w:t xml:space="preserve">, </w:t>
+            </w:r>
+            <w:r>
+              <w:rPr>
+                <w:rFonts w:ascii="Consolas" w:hAnsi="Consolas"/>
+                <w:sz w:val="21"/>
+              </w:rPr>
+              <w:t>hold_changes</w:t>
+            </w:r>
+            <w:r>
+              <w:rPr>
+                <w:sz w:val="21"/>
+              </w:rPr>
+              <w:t xml:space="preserve">, </w:t>
+            </w:r>
+            <w:r>
+              <w:rPr>
+                <w:rFonts w:ascii="Consolas" w:hAnsi="Consolas"/>
+                <w:sz w:val="21"/>
+              </w:rPr>
+              <w:t>loan_extensions</w:t>
+            </w:r>
+            <w:r>
+              <w:rPr>
+                <w:sz w:val="21"/>
+              </w:rPr>
+              <w:t xml:space="preserve">, </w:t>
+            </w:r>
+            <w:r>
+              <w:rPr>
+                <w:rFonts w:ascii="Consolas" w:hAnsi="Consolas"/>
+                <w:sz w:val="21"/>
+              </w:rPr>
+              <w:t>hold_no_show_decisions</w:t>
+            </w:r>
+          </w:p>
+        </w:tc>
+        <w:tc>
+          <w:tcPr>
+            <w:tcW w:w="2948" w:type="dxa"/>
+            <w:shd w:val="clear" w:color="auto" w:fill="F1F5FA"/>
+            <w:tcMar>
+              <w:top w:w="100" w:type="dxa"/>
+              <w:left w:w="100" w:type="dxa"/>
+              <w:bottom w:w="100" w:type="dxa"/>
+              <w:right w:w="100" w:type="dxa"/>
+            </w:tcMar>
+            <w:vAlign w:val="center"/>
+          </w:tcPr>
+          <w:p>
+            <w:pPr>
+              <w:keepLines/>
+              <w:spacing w:after="60"/>
+            </w:pPr>
+            <w:r>
+              <w:rPr>
+                <w:sz w:val="21"/>
+              </w:rPr>
+              <w:t>Giao d</w:t>
+            </w:r>
+            <w:r>
+              <w:rPr>
+                <w:sz w:val="21"/>
+              </w:rPr>
+              <w:t>ị</w:t>
+            </w:r>
+            <w:r>
+              <w:rPr>
+                <w:sz w:val="21"/>
+              </w:rPr>
+              <w:t>ch mư</w:t>
+            </w:r>
+            <w:r>
+              <w:rPr>
+                <w:sz w:val="21"/>
+              </w:rPr>
+              <w:t>ợ</w:t>
+            </w:r>
+            <w:r>
+              <w:rPr>
+                <w:sz w:val="21"/>
+              </w:rPr>
+              <w:t>n/tr</w:t>
+            </w:r>
+            <w:r>
+              <w:rPr>
+                <w:sz w:val="21"/>
+              </w:rPr>
+              <w:t>ả</w:t>
+            </w:r>
+            <w:r>
+              <w:rPr>
+                <w:sz w:val="21"/>
+              </w:rPr>
+              <w:t>, hàng ch</w:t>
+            </w:r>
+            <w:r>
+              <w:rPr>
+                <w:sz w:val="21"/>
+              </w:rPr>
+              <w:t>ờ</w:t>
+            </w:r>
+            <w:r>
+              <w:rPr>
+                <w:sz w:val="21"/>
+              </w:rPr>
+              <w:t xml:space="preserve"> và d</w:t>
+            </w:r>
+            <w:r>
+              <w:rPr>
+                <w:sz w:val="21"/>
+              </w:rPr>
+              <w:t>ấ</w:t>
+            </w:r>
+            <w:r>
+              <w:rPr>
+                <w:sz w:val="21"/>
+              </w:rPr>
+              <w:t>u v</w:t>
+            </w:r>
+            <w:r>
+              <w:rPr>
+                <w:sz w:val="21"/>
+              </w:rPr>
+              <w:t>ế</w:t>
+            </w:r>
+            <w:r>
+              <w:rPr>
+                <w:sz w:val="21"/>
+              </w:rPr>
+              <w:t>t quy</w:t>
+            </w:r>
+            <w:r>
+              <w:rPr>
+                <w:sz w:val="21"/>
+              </w:rPr>
+              <w:t>ế</w:t>
+            </w:r>
+            <w:r>
+              <w:rPr>
+                <w:sz w:val="21"/>
+              </w:rPr>
+              <w:t>t đ</w:t>
+            </w:r>
+            <w:r>
+              <w:rPr>
+                <w:sz w:val="21"/>
+              </w:rPr>
+              <w:t>ị</w:t>
+            </w:r>
+            <w:r>
+              <w:rPr>
+                <w:sz w:val="21"/>
+              </w:rPr>
+              <w:t>nh.</w:t>
+            </w:r>
+          </w:p>
+        </w:tc>
+      </w:tr>
+      <w:tr>
+        <w:trPr>
+          <w:cantSplit/>
+        </w:trPr>
+        <w:tc>
+          <w:tcPr>
+            <w:tcW w:w="2551" w:type="dxa"/>
+            <w:shd w:val="clear" w:color="auto" w:fill="FFFFFF"/>
+            <w:tcMar>
+              <w:top w:w="100" w:type="dxa"/>
+              <w:left w:w="100" w:type="dxa"/>
+              <w:bottom w:w="100" w:type="dxa"/>
+              <w:right w:w="100" w:type="dxa"/>
+            </w:tcMar>
+            <w:vAlign w:val="center"/>
+          </w:tcPr>
+          <w:p>
+            <w:pPr>
+              <w:keepLines/>
+              <w:spacing w:after="60"/>
+            </w:pPr>
+            <w:r>
+              <w:rPr>
+                <w:sz w:val="21"/>
+              </w:rPr>
+              <w:lastRenderedPageBreak/>
+              <w:t>Tương tác ngư</w:t>
+            </w:r>
+            <w:r>
+              <w:rPr>
+                <w:sz w:val="21"/>
+              </w:rPr>
+              <w:t>ờ</w:t>
+            </w:r>
+            <w:r>
+              <w:rPr>
+                <w:sz w:val="21"/>
+              </w:rPr>
+              <w:t>i đ</w:t>
+            </w:r>
+            <w:r>
+              <w:rPr>
+                <w:sz w:val="21"/>
+              </w:rPr>
+              <w:t>ọ</w:t>
+            </w:r>
+            <w:r>
+              <w:rPr>
+                <w:sz w:val="21"/>
+              </w:rPr>
+              <w:t>c</w:t>
+            </w:r>
+          </w:p>
+        </w:tc>
+        <w:tc>
+          <w:tcPr>
+            <w:tcW w:w="3685" w:type="dxa"/>
+            <w:shd w:val="clear" w:color="auto" w:fill="FFFFFF"/>
+            <w:tcMar>
+              <w:top w:w="100" w:type="dxa"/>
+              <w:left w:w="100" w:type="dxa"/>
+              <w:bottom w:w="100" w:type="dxa"/>
+              <w:right w:w="100" w:type="dxa"/>
+            </w:tcMar>
+            <w:vAlign w:val="center"/>
+          </w:tcPr>
+          <w:p>
+            <w:pPr>
+              <w:keepLines/>
+              <w:spacing w:after="60"/>
+            </w:pPr>
+            <w:r>
+              <w:rPr>
+                <w:rFonts w:ascii="Consolas" w:hAnsi="Consolas"/>
+                <w:sz w:val="21"/>
+              </w:rPr>
+              <w:t>favorites</w:t>
+            </w:r>
+            <w:r>
+              <w:rPr>
+                <w:sz w:val="21"/>
+              </w:rPr>
+              <w:t xml:space="preserve">, </w:t>
+            </w:r>
+            <w:r>
+              <w:rPr>
+                <w:rFonts w:ascii="Consolas" w:hAnsi="Consolas"/>
+                <w:sz w:val="21"/>
+              </w:rPr>
+              <w:t>reviews</w:t>
+            </w:r>
+            <w:r>
+              <w:rPr>
+                <w:sz w:val="21"/>
+              </w:rPr>
+              <w:t xml:space="preserve">, </w:t>
+            </w:r>
+            <w:r>
+              <w:rPr>
+                <w:rFonts w:ascii="Consolas" w:hAnsi="Consolas"/>
+                <w:sz w:val="21"/>
+              </w:rPr>
+              <w:t>review_reports</w:t>
+            </w:r>
+            <w:r>
+              <w:rPr>
+                <w:sz w:val="21"/>
+              </w:rPr>
+              <w:t xml:space="preserve">, </w:t>
+            </w:r>
+            <w:r>
+              <w:rPr>
+                <w:rFonts w:ascii="Consolas" w:hAnsi="Consolas"/>
+                <w:sz w:val="21"/>
+              </w:rPr>
+              <w:t>review_moderation_audit</w:t>
+            </w:r>
+          </w:p>
+        </w:tc>
+        <w:tc>
+          <w:tcPr>
+            <w:tcW w:w="2948" w:type="dxa"/>
+            <w:shd w:val="clear" w:color="auto" w:fill="FFFFFF"/>
+            <w:tcMar>
+              <w:top w:w="100" w:type="dxa"/>
+              <w:left w:w="100" w:type="dxa"/>
+              <w:bottom w:w="100" w:type="dxa"/>
+              <w:right w:w="100" w:type="dxa"/>
+            </w:tcMar>
+            <w:vAlign w:val="center"/>
+          </w:tcPr>
+          <w:p>
+            <w:pPr>
+              <w:keepLines/>
+              <w:spacing w:after="60"/>
+            </w:pPr>
+            <w:r>
+              <w:rPr>
+                <w:sz w:val="21"/>
+              </w:rPr>
+              <w:t>Sách yêu thích, đánh giá và ki</w:t>
+            </w:r>
+            <w:r>
+              <w:rPr>
+                <w:sz w:val="21"/>
+              </w:rPr>
+              <w:t>ể</w:t>
+            </w:r>
+            <w:r>
+              <w:rPr>
+                <w:sz w:val="21"/>
+              </w:rPr>
+              <w:t>m duy</w:t>
+            </w:r>
+            <w:r>
+              <w:rPr>
+                <w:sz w:val="21"/>
+              </w:rPr>
+              <w:t>ệ</w:t>
+            </w:r>
+            <w:r>
+              <w:rPr>
+                <w:sz w:val="21"/>
+              </w:rPr>
+              <w:t>t.</w:t>
+            </w:r>
+          </w:p>
+        </w:tc>
+      </w:tr>
+    </w:tbl>
+    <w:p/>
+    <w:p>
+      <w:pPr>
         <w:pStyle w:val="Heading2"/>
       </w:pPr>
-      <w:bookmarkStart w:id="81" w:name="_Toc244113403"/>
+      <w:bookmarkStart w:id="82" w:name="_Toc244113911"/>
       <w:r>
         <w:t>Ph</w:t>
       </w:r>
@@ -42515,7 +44117,7 @@
       <w:r>
         <w:t>ử</w:t>
       </w:r>
-      <w:bookmarkEnd w:id="81"/>
+      <w:bookmarkEnd w:id="82"/>
     </w:p>
     <w:p>
       <w:r>
@@ -42728,7 +44330,7 @@
       <w:pPr>
         <w:pStyle w:val="Heading2"/>
       </w:pPr>
-      <w:bookmarkStart w:id="82" w:name="_Toc244113404"/>
+      <w:bookmarkStart w:id="83" w:name="_Toc244113912"/>
       <w:r>
         <w:t>Ph</w:t>
       </w:r>
@@ -42759,7 +44361,7 @@
       <w:r>
         <w:t>ồ</w:t>
       </w:r>
-      <w:bookmarkEnd w:id="82"/>
+      <w:bookmarkEnd w:id="83"/>
     </w:p>
     <w:p>
       <w:r>
@@ -42991,7 +44593,7 @@
       <w:pPr>
         <w:pStyle w:val="Heading2"/>
       </w:pPr>
-      <w:bookmarkStart w:id="83" w:name="_Toc244113405"/>
+      <w:bookmarkStart w:id="84" w:name="_Toc244113913"/>
       <w:r>
         <w:t>Ph</w:t>
       </w:r>
@@ -43019,7 +44621,7 @@
       <w:r>
         <w:t>n bàn giao</w:t>
       </w:r>
-      <w:bookmarkEnd w:id="83"/>
+      <w:bookmarkEnd w:id="84"/>
     </w:p>
     <w:p>
       <w:r>
@@ -43445,31 +45047,31 @@
       </w:rPr>
     </w:lvl>
   </w:abstractNum>
-  <w:num w:numId="1" w16cid:durableId="1991246379">
+  <w:num w:numId="1" w16cid:durableId="496270490">
     <w:abstractNumId w:val="8"/>
   </w:num>
-  <w:num w:numId="2" w16cid:durableId="1088189586">
+  <w:num w:numId="2" w16cid:durableId="1119226175">
     <w:abstractNumId w:val="6"/>
   </w:num>
-  <w:num w:numId="3" w16cid:durableId="285282992">
+  <w:num w:numId="3" w16cid:durableId="1505625427">
     <w:abstractNumId w:val="5"/>
   </w:num>
-  <w:num w:numId="4" w16cid:durableId="2080784112">
+  <w:num w:numId="4" w16cid:durableId="1934972768">
     <w:abstractNumId w:val="4"/>
   </w:num>
-  <w:num w:numId="5" w16cid:durableId="894894700">
+  <w:num w:numId="5" w16cid:durableId="238059278">
     <w:abstractNumId w:val="7"/>
   </w:num>
-  <w:num w:numId="6" w16cid:durableId="151259337">
+  <w:num w:numId="6" w16cid:durableId="1911428669">
     <w:abstractNumId w:val="3"/>
   </w:num>
-  <w:num w:numId="7" w16cid:durableId="1340622170">
+  <w:num w:numId="7" w16cid:durableId="1850949101">
     <w:abstractNumId w:val="2"/>
   </w:num>
-  <w:num w:numId="8" w16cid:durableId="2041012347">
+  <w:num w:numId="8" w16cid:durableId="1631473817">
     <w:abstractNumId w:val="1"/>
   </w:num>
-  <w:num w:numId="9" w16cid:durableId="665791023">
+  <w:num w:numId="9" w16cid:durableId="1551067247">
     <w:abstractNumId w:val="0"/>
   </w:num>
 </w:numbering>
@@ -54868,7 +56470,7 @@
     <w:autoRedefine/>
     <w:uiPriority w:val="39"/>
     <w:unhideWhenUsed/>
-    <w:rsid w:val="0019129F"/>
+    <w:rsid w:val="00787350"/>
   </w:style>
   <w:style w:type="paragraph" w:styleId="TOC2">
     <w:name w:val="toc 2"/>
@@ -54877,7 +56479,7 @@
     <w:autoRedefine/>
     <w:uiPriority w:val="39"/>
     <w:unhideWhenUsed/>
-    <w:rsid w:val="0019129F"/>
+    <w:rsid w:val="00787350"/>
     <w:pPr>
       <w:ind w:left="260"/>
     </w:pPr>
@@ -54887,7 +56489,7 @@
     <w:basedOn w:val="DefaultParagraphFont"/>
     <w:uiPriority w:val="99"/>
     <w:unhideWhenUsed/>
-    <w:rsid w:val="0019129F"/>
+    <w:rsid w:val="00787350"/>
     <w:rPr>
       <w:color w:val="0000FF" w:themeColor="hyperlink"/>
       <w:u w:val="single"/>

</xml_diff>